<commit_message>
Update Arduino portfolio with correct resistor values and images
Updated the Hardware Interfacing Arduino portfolio document.

Changes made:
- Added the correct resistor values for the assignments.
- Specified which resistors are used for the buttons and LEDs.
- Updated assignment 3 with the correct image.
- Updated assignment 4 with the correct image showing 7 LEDs.
- Improved the documentation so the used components are clearer.
</commit_message>
<xml_diff>
--- a/documentatie/Hardware_Interfacing_Arduino_Portfolio_StefanS.docx
+++ b/documentatie/Hardware_Interfacing_Arduino_Portfolio_StefanS.docx
@@ -224,7 +224,7 @@
     </w:p>
     <w:tbl>
       <w:tblPr>
-        <w:tblStyle w:val="TableGrid"/>
+        <w:tblStyle w:val="Tabelraster"/>
         <w:tblW w:w="9592" w:type="dxa"/>
         <w:jc w:val="center"/>
         <w:tblLayout w:type="fixed"/>
@@ -524,7 +524,7 @@
     </w:p>
     <w:p>
       <w:pPr>
-        <w:pStyle w:val="Heading1"/>
+        <w:pStyle w:val="Kop1"/>
         <w:spacing w:before="0"/>
         <w:rPr>
           <w:rFonts w:ascii="Arial" w:hAnsi="Arial" w:cs="Arial"/>
@@ -548,7 +548,7 @@
     </w:p>
     <w:tbl>
       <w:tblPr>
-        <w:tblStyle w:val="TableGrid"/>
+        <w:tblStyle w:val="Tabelraster"/>
         <w:tblW w:w="9592" w:type="dxa"/>
         <w:jc w:val="center"/>
         <w:tblLayout w:type="fixed"/>
@@ -1173,7 +1173,7 @@
       <w:sdtContent>
         <w:p>
           <w:pPr>
-            <w:pStyle w:val="TOCHeading"/>
+            <w:pStyle w:val="Kopvaninhoudsopgave"/>
             <w:rPr>
               <w:rFonts w:ascii="Arial" w:hAnsi="Arial" w:cs="Arial"/>
               <w:sz w:val="36"/>
@@ -1188,7 +1188,6 @@
             </w:rPr>
             <w:br w:type="page"/>
           </w:r>
-          <w:proofErr w:type="spellStart"/>
           <w:r>
             <w:rPr>
               <w:rFonts w:ascii="Arial" w:hAnsi="Arial" w:cs="Arial"/>
@@ -1198,11 +1197,10 @@
             <w:lastRenderedPageBreak/>
             <w:t>Inhoud</w:t>
           </w:r>
-          <w:proofErr w:type="spellEnd"/>
         </w:p>
         <w:p>
           <w:pPr>
-            <w:pStyle w:val="TOC1"/>
+            <w:pStyle w:val="Inhopg1"/>
             <w:rPr>
               <w:rFonts w:eastAsiaTheme="minorEastAsia" w:cstheme="minorBidi"/>
               <w:b w:val="0"/>
@@ -1298,7 +1296,7 @@
         </w:p>
         <w:p>
           <w:pPr>
-            <w:pStyle w:val="TOC1"/>
+            <w:pStyle w:val="Inhopg1"/>
             <w:rPr>
               <w:rFonts w:eastAsiaTheme="minorEastAsia" w:cstheme="minorBidi"/>
               <w:b w:val="0"/>
@@ -1372,7 +1370,7 @@
         </w:p>
         <w:p>
           <w:pPr>
-            <w:pStyle w:val="TOC1"/>
+            <w:pStyle w:val="Inhopg1"/>
             <w:rPr>
               <w:rFonts w:eastAsiaTheme="minorEastAsia" w:cstheme="minorBidi"/>
               <w:b w:val="0"/>
@@ -1446,7 +1444,7 @@
         </w:p>
         <w:p>
           <w:pPr>
-            <w:pStyle w:val="TOC1"/>
+            <w:pStyle w:val="Inhopg1"/>
             <w:rPr>
               <w:rFonts w:eastAsiaTheme="minorEastAsia" w:cstheme="minorBidi"/>
               <w:b w:val="0"/>
@@ -1520,7 +1518,7 @@
         </w:p>
         <w:p>
           <w:pPr>
-            <w:pStyle w:val="TOC2"/>
+            <w:pStyle w:val="Inhopg2"/>
             <w:rPr>
               <w:rFonts w:eastAsiaTheme="minorEastAsia" w:cstheme="minorBidi"/>
               <w:iCs w:val="0"/>
@@ -1593,7 +1591,7 @@
         </w:p>
         <w:p>
           <w:pPr>
-            <w:pStyle w:val="TOC1"/>
+            <w:pStyle w:val="Inhopg1"/>
             <w:rPr>
               <w:rFonts w:eastAsiaTheme="minorEastAsia" w:cstheme="minorBidi"/>
               <w:b w:val="0"/>
@@ -1667,7 +1665,7 @@
         </w:p>
         <w:p>
           <w:pPr>
-            <w:pStyle w:val="TOC2"/>
+            <w:pStyle w:val="Inhopg2"/>
             <w:rPr>
               <w:rFonts w:eastAsiaTheme="minorEastAsia" w:cstheme="minorBidi"/>
               <w:iCs w:val="0"/>
@@ -1740,7 +1738,7 @@
         </w:p>
         <w:p>
           <w:pPr>
-            <w:pStyle w:val="TOC2"/>
+            <w:pStyle w:val="Inhopg2"/>
             <w:rPr>
               <w:rFonts w:eastAsiaTheme="minorEastAsia" w:cstheme="minorBidi"/>
               <w:iCs w:val="0"/>
@@ -1813,7 +1811,7 @@
         </w:p>
         <w:p>
           <w:pPr>
-            <w:pStyle w:val="TOC2"/>
+            <w:pStyle w:val="Inhopg2"/>
             <w:rPr>
               <w:rFonts w:eastAsiaTheme="minorEastAsia" w:cstheme="minorBidi"/>
               <w:iCs w:val="0"/>
@@ -1886,7 +1884,7 @@
         </w:p>
         <w:p>
           <w:pPr>
-            <w:pStyle w:val="TOC2"/>
+            <w:pStyle w:val="Inhopg2"/>
             <w:rPr>
               <w:rFonts w:eastAsiaTheme="minorEastAsia" w:cstheme="minorBidi"/>
               <w:iCs w:val="0"/>
@@ -1959,7 +1957,7 @@
         </w:p>
         <w:p>
           <w:pPr>
-            <w:pStyle w:val="TOC2"/>
+            <w:pStyle w:val="Inhopg2"/>
             <w:rPr>
               <w:rFonts w:eastAsiaTheme="minorEastAsia" w:cstheme="minorBidi"/>
               <w:iCs w:val="0"/>
@@ -2032,7 +2030,7 @@
         </w:p>
         <w:p>
           <w:pPr>
-            <w:pStyle w:val="TOC2"/>
+            <w:pStyle w:val="Inhopg2"/>
             <w:rPr>
               <w:rFonts w:eastAsiaTheme="minorEastAsia" w:cstheme="minorBidi"/>
               <w:iCs w:val="0"/>
@@ -2105,7 +2103,7 @@
         </w:p>
         <w:p>
           <w:pPr>
-            <w:pStyle w:val="TOC2"/>
+            <w:pStyle w:val="Inhopg2"/>
             <w:rPr>
               <w:rFonts w:eastAsiaTheme="minorEastAsia" w:cstheme="minorBidi"/>
               <w:iCs w:val="0"/>
@@ -2178,7 +2176,7 @@
         </w:p>
         <w:p>
           <w:pPr>
-            <w:pStyle w:val="TOC2"/>
+            <w:pStyle w:val="Inhopg2"/>
             <w:rPr>
               <w:rFonts w:eastAsiaTheme="minorEastAsia" w:cstheme="minorBidi"/>
               <w:iCs w:val="0"/>
@@ -2251,7 +2249,7 @@
         </w:p>
         <w:p>
           <w:pPr>
-            <w:pStyle w:val="TOC2"/>
+            <w:pStyle w:val="Inhopg2"/>
             <w:rPr>
               <w:rFonts w:eastAsiaTheme="minorEastAsia" w:cstheme="minorBidi"/>
               <w:iCs w:val="0"/>
@@ -2324,7 +2322,7 @@
         </w:p>
         <w:p>
           <w:pPr>
-            <w:pStyle w:val="TOC1"/>
+            <w:pStyle w:val="Inhopg1"/>
             <w:rPr>
               <w:rFonts w:eastAsiaTheme="minorEastAsia" w:cstheme="minorBidi"/>
               <w:b w:val="0"/>
@@ -2398,7 +2396,7 @@
         </w:p>
         <w:p>
           <w:pPr>
-            <w:pStyle w:val="TOC2"/>
+            <w:pStyle w:val="Inhopg2"/>
             <w:rPr>
               <w:rFonts w:eastAsiaTheme="minorEastAsia" w:cstheme="minorBidi"/>
               <w:iCs w:val="0"/>
@@ -2471,7 +2469,7 @@
         </w:p>
         <w:p>
           <w:pPr>
-            <w:pStyle w:val="TOC2"/>
+            <w:pStyle w:val="Inhopg2"/>
             <w:rPr>
               <w:rFonts w:eastAsiaTheme="minorEastAsia" w:cstheme="minorBidi"/>
               <w:iCs w:val="0"/>
@@ -2544,7 +2542,7 @@
         </w:p>
         <w:p>
           <w:pPr>
-            <w:pStyle w:val="TOC2"/>
+            <w:pStyle w:val="Inhopg2"/>
             <w:rPr>
               <w:rFonts w:eastAsiaTheme="minorEastAsia" w:cstheme="minorBidi"/>
               <w:iCs w:val="0"/>
@@ -2617,7 +2615,7 @@
         </w:p>
         <w:p>
           <w:pPr>
-            <w:pStyle w:val="TOC2"/>
+            <w:pStyle w:val="Inhopg2"/>
             <w:rPr>
               <w:rFonts w:eastAsiaTheme="minorEastAsia" w:cstheme="minorBidi"/>
               <w:iCs w:val="0"/>
@@ -2690,7 +2688,7 @@
         </w:p>
         <w:p>
           <w:pPr>
-            <w:pStyle w:val="TOC2"/>
+            <w:pStyle w:val="Inhopg2"/>
             <w:rPr>
               <w:rFonts w:eastAsiaTheme="minorEastAsia" w:cstheme="minorBidi"/>
               <w:iCs w:val="0"/>
@@ -2763,7 +2761,7 @@
         </w:p>
         <w:p>
           <w:pPr>
-            <w:pStyle w:val="TOC2"/>
+            <w:pStyle w:val="Inhopg2"/>
             <w:rPr>
               <w:rFonts w:eastAsiaTheme="minorEastAsia" w:cstheme="minorBidi"/>
               <w:iCs w:val="0"/>
@@ -2836,7 +2834,7 @@
         </w:p>
         <w:p>
           <w:pPr>
-            <w:pStyle w:val="TOC2"/>
+            <w:pStyle w:val="Inhopg2"/>
             <w:rPr>
               <w:rFonts w:eastAsiaTheme="minorEastAsia" w:cstheme="minorBidi"/>
               <w:iCs w:val="0"/>
@@ -2909,7 +2907,7 @@
         </w:p>
         <w:p>
           <w:pPr>
-            <w:pStyle w:val="TOC2"/>
+            <w:pStyle w:val="Inhopg2"/>
             <w:rPr>
               <w:rFonts w:eastAsiaTheme="minorEastAsia" w:cstheme="minorBidi"/>
               <w:iCs w:val="0"/>
@@ -2982,7 +2980,7 @@
         </w:p>
         <w:p>
           <w:pPr>
-            <w:pStyle w:val="TOC2"/>
+            <w:pStyle w:val="Inhopg2"/>
             <w:rPr>
               <w:rFonts w:eastAsiaTheme="minorEastAsia" w:cstheme="minorBidi"/>
               <w:iCs w:val="0"/>
@@ -3055,7 +3053,7 @@
         </w:p>
         <w:p>
           <w:pPr>
-            <w:pStyle w:val="TOC1"/>
+            <w:pStyle w:val="Inhopg1"/>
             <w:rPr>
               <w:rFonts w:eastAsiaTheme="minorEastAsia" w:cstheme="minorBidi"/>
               <w:b w:val="0"/>
@@ -3129,7 +3127,7 @@
         </w:p>
         <w:p>
           <w:pPr>
-            <w:pStyle w:val="TOC2"/>
+            <w:pStyle w:val="Inhopg2"/>
             <w:rPr>
               <w:rFonts w:eastAsiaTheme="minorEastAsia" w:cstheme="minorBidi"/>
               <w:iCs w:val="0"/>
@@ -3202,7 +3200,7 @@
         </w:p>
         <w:p>
           <w:pPr>
-            <w:pStyle w:val="TOC2"/>
+            <w:pStyle w:val="Inhopg2"/>
             <w:rPr>
               <w:rFonts w:eastAsiaTheme="minorEastAsia" w:cstheme="minorBidi"/>
               <w:iCs w:val="0"/>
@@ -3275,7 +3273,7 @@
         </w:p>
         <w:p>
           <w:pPr>
-            <w:pStyle w:val="TOC2"/>
+            <w:pStyle w:val="Inhopg2"/>
             <w:rPr>
               <w:rFonts w:eastAsiaTheme="minorEastAsia" w:cstheme="minorBidi"/>
               <w:iCs w:val="0"/>
@@ -3348,7 +3346,7 @@
         </w:p>
         <w:p>
           <w:pPr>
-            <w:pStyle w:val="TOC2"/>
+            <w:pStyle w:val="Inhopg2"/>
             <w:rPr>
               <w:rFonts w:eastAsiaTheme="minorEastAsia" w:cstheme="minorBidi"/>
               <w:iCs w:val="0"/>
@@ -3421,7 +3419,7 @@
         </w:p>
         <w:p>
           <w:pPr>
-            <w:pStyle w:val="TOC2"/>
+            <w:pStyle w:val="Inhopg2"/>
             <w:rPr>
               <w:rFonts w:eastAsiaTheme="minorEastAsia" w:cstheme="minorBidi"/>
               <w:iCs w:val="0"/>
@@ -3494,7 +3492,7 @@
         </w:p>
         <w:p>
           <w:pPr>
-            <w:pStyle w:val="TOC2"/>
+            <w:pStyle w:val="Inhopg2"/>
             <w:rPr>
               <w:rFonts w:eastAsiaTheme="minorEastAsia" w:cstheme="minorBidi"/>
               <w:iCs w:val="0"/>
@@ -3567,7 +3565,7 @@
         </w:p>
         <w:p>
           <w:pPr>
-            <w:pStyle w:val="TOC2"/>
+            <w:pStyle w:val="Inhopg2"/>
             <w:rPr>
               <w:rFonts w:eastAsiaTheme="minorEastAsia" w:cstheme="minorBidi"/>
               <w:iCs w:val="0"/>
@@ -3640,7 +3638,7 @@
         </w:p>
         <w:p>
           <w:pPr>
-            <w:pStyle w:val="TOC2"/>
+            <w:pStyle w:val="Inhopg2"/>
             <w:rPr>
               <w:rFonts w:eastAsiaTheme="minorEastAsia" w:cstheme="minorBidi"/>
               <w:iCs w:val="0"/>
@@ -3713,7 +3711,7 @@
         </w:p>
         <w:p>
           <w:pPr>
-            <w:pStyle w:val="TOC2"/>
+            <w:pStyle w:val="Inhopg2"/>
             <w:rPr>
               <w:rFonts w:eastAsiaTheme="minorEastAsia" w:cstheme="minorBidi"/>
               <w:iCs w:val="0"/>
@@ -3786,7 +3784,7 @@
         </w:p>
         <w:p>
           <w:pPr>
-            <w:pStyle w:val="TOC1"/>
+            <w:pStyle w:val="Inhopg1"/>
             <w:rPr>
               <w:rFonts w:eastAsiaTheme="minorEastAsia" w:cstheme="minorBidi"/>
               <w:b w:val="0"/>
@@ -3860,7 +3858,7 @@
         </w:p>
         <w:p>
           <w:pPr>
-            <w:pStyle w:val="TOC2"/>
+            <w:pStyle w:val="Inhopg2"/>
             <w:rPr>
               <w:rFonts w:eastAsiaTheme="minorEastAsia" w:cstheme="minorBidi"/>
               <w:iCs w:val="0"/>
@@ -3933,7 +3931,7 @@
         </w:p>
         <w:p>
           <w:pPr>
-            <w:pStyle w:val="TOC2"/>
+            <w:pStyle w:val="Inhopg2"/>
             <w:rPr>
               <w:rFonts w:eastAsiaTheme="minorEastAsia" w:cstheme="minorBidi"/>
               <w:iCs w:val="0"/>
@@ -4006,7 +4004,7 @@
         </w:p>
         <w:p>
           <w:pPr>
-            <w:pStyle w:val="TOC2"/>
+            <w:pStyle w:val="Inhopg2"/>
             <w:rPr>
               <w:rFonts w:eastAsiaTheme="minorEastAsia" w:cstheme="minorBidi"/>
               <w:iCs w:val="0"/>
@@ -4079,7 +4077,7 @@
         </w:p>
         <w:p>
           <w:pPr>
-            <w:pStyle w:val="TOC2"/>
+            <w:pStyle w:val="Inhopg2"/>
             <w:rPr>
               <w:rFonts w:eastAsiaTheme="minorEastAsia" w:cstheme="minorBidi"/>
               <w:iCs w:val="0"/>
@@ -4152,7 +4150,7 @@
         </w:p>
         <w:p>
           <w:pPr>
-            <w:pStyle w:val="TOC2"/>
+            <w:pStyle w:val="Inhopg2"/>
             <w:rPr>
               <w:rFonts w:eastAsiaTheme="minorEastAsia" w:cstheme="minorBidi"/>
               <w:iCs w:val="0"/>
@@ -4225,7 +4223,7 @@
         </w:p>
         <w:p>
           <w:pPr>
-            <w:pStyle w:val="TOC2"/>
+            <w:pStyle w:val="Inhopg2"/>
             <w:rPr>
               <w:rFonts w:eastAsiaTheme="minorEastAsia" w:cstheme="minorBidi"/>
               <w:iCs w:val="0"/>
@@ -4298,7 +4296,7 @@
         </w:p>
         <w:p>
           <w:pPr>
-            <w:pStyle w:val="TOC2"/>
+            <w:pStyle w:val="Inhopg2"/>
             <w:rPr>
               <w:rFonts w:eastAsiaTheme="minorEastAsia" w:cstheme="minorBidi"/>
               <w:iCs w:val="0"/>
@@ -4371,7 +4369,7 @@
         </w:p>
         <w:p>
           <w:pPr>
-            <w:pStyle w:val="TOC2"/>
+            <w:pStyle w:val="Inhopg2"/>
             <w:rPr>
               <w:rFonts w:eastAsiaTheme="minorEastAsia" w:cstheme="minorBidi"/>
               <w:iCs w:val="0"/>
@@ -4444,7 +4442,7 @@
         </w:p>
         <w:p>
           <w:pPr>
-            <w:pStyle w:val="TOC2"/>
+            <w:pStyle w:val="Inhopg2"/>
             <w:rPr>
               <w:rFonts w:eastAsiaTheme="minorEastAsia" w:cstheme="minorBidi"/>
               <w:iCs w:val="0"/>
@@ -4517,7 +4515,7 @@
         </w:p>
         <w:p>
           <w:pPr>
-            <w:pStyle w:val="TOC1"/>
+            <w:pStyle w:val="Inhopg1"/>
             <w:rPr>
               <w:rFonts w:eastAsiaTheme="minorEastAsia" w:cstheme="minorBidi"/>
               <w:b w:val="0"/>
@@ -4591,7 +4589,7 @@
         </w:p>
         <w:p>
           <w:pPr>
-            <w:pStyle w:val="TOC2"/>
+            <w:pStyle w:val="Inhopg2"/>
             <w:rPr>
               <w:rFonts w:eastAsiaTheme="minorEastAsia" w:cstheme="minorBidi"/>
               <w:iCs w:val="0"/>
@@ -4664,7 +4662,7 @@
         </w:p>
         <w:p>
           <w:pPr>
-            <w:pStyle w:val="TOC2"/>
+            <w:pStyle w:val="Inhopg2"/>
             <w:rPr>
               <w:rFonts w:eastAsiaTheme="minorEastAsia" w:cstheme="minorBidi"/>
               <w:iCs w:val="0"/>
@@ -4737,7 +4735,7 @@
         </w:p>
         <w:p>
           <w:pPr>
-            <w:pStyle w:val="TOC2"/>
+            <w:pStyle w:val="Inhopg2"/>
             <w:rPr>
               <w:rFonts w:eastAsiaTheme="minorEastAsia" w:cstheme="minorBidi"/>
               <w:iCs w:val="0"/>
@@ -4810,7 +4808,7 @@
         </w:p>
         <w:p>
           <w:pPr>
-            <w:pStyle w:val="TOC2"/>
+            <w:pStyle w:val="Inhopg2"/>
             <w:rPr>
               <w:rFonts w:eastAsiaTheme="minorEastAsia" w:cstheme="minorBidi"/>
               <w:iCs w:val="0"/>
@@ -4883,7 +4881,7 @@
         </w:p>
         <w:p>
           <w:pPr>
-            <w:pStyle w:val="TOC2"/>
+            <w:pStyle w:val="Inhopg2"/>
             <w:rPr>
               <w:rFonts w:eastAsiaTheme="minorEastAsia" w:cstheme="minorBidi"/>
               <w:iCs w:val="0"/>
@@ -4956,7 +4954,7 @@
         </w:p>
         <w:p>
           <w:pPr>
-            <w:pStyle w:val="TOC2"/>
+            <w:pStyle w:val="Inhopg2"/>
             <w:rPr>
               <w:rFonts w:eastAsiaTheme="minorEastAsia" w:cstheme="minorBidi"/>
               <w:iCs w:val="0"/>
@@ -5029,7 +5027,7 @@
         </w:p>
         <w:p>
           <w:pPr>
-            <w:pStyle w:val="TOC2"/>
+            <w:pStyle w:val="Inhopg2"/>
             <w:rPr>
               <w:rFonts w:eastAsiaTheme="minorEastAsia" w:cstheme="minorBidi"/>
               <w:iCs w:val="0"/>
@@ -5102,7 +5100,7 @@
         </w:p>
         <w:p>
           <w:pPr>
-            <w:pStyle w:val="TOC2"/>
+            <w:pStyle w:val="Inhopg2"/>
             <w:rPr>
               <w:rFonts w:eastAsiaTheme="minorEastAsia" w:cstheme="minorBidi"/>
               <w:iCs w:val="0"/>
@@ -5175,7 +5173,7 @@
         </w:p>
         <w:p>
           <w:pPr>
-            <w:pStyle w:val="TOC2"/>
+            <w:pStyle w:val="Inhopg2"/>
             <w:rPr>
               <w:rFonts w:eastAsiaTheme="minorEastAsia" w:cstheme="minorBidi"/>
               <w:iCs w:val="0"/>
@@ -5248,7 +5246,7 @@
         </w:p>
         <w:p>
           <w:pPr>
-            <w:pStyle w:val="TOC1"/>
+            <w:pStyle w:val="Inhopg1"/>
             <w:rPr>
               <w:rFonts w:eastAsiaTheme="minorEastAsia" w:cstheme="minorBidi"/>
               <w:b w:val="0"/>
@@ -5322,7 +5320,7 @@
         </w:p>
         <w:p>
           <w:pPr>
-            <w:pStyle w:val="TOC2"/>
+            <w:pStyle w:val="Inhopg2"/>
             <w:rPr>
               <w:rFonts w:eastAsiaTheme="minorEastAsia" w:cstheme="minorBidi"/>
               <w:iCs w:val="0"/>
@@ -5395,7 +5393,7 @@
         </w:p>
         <w:p>
           <w:pPr>
-            <w:pStyle w:val="TOC2"/>
+            <w:pStyle w:val="Inhopg2"/>
             <w:rPr>
               <w:rFonts w:eastAsiaTheme="minorEastAsia" w:cstheme="minorBidi"/>
               <w:iCs w:val="0"/>
@@ -5468,7 +5466,7 @@
         </w:p>
         <w:p>
           <w:pPr>
-            <w:pStyle w:val="TOC2"/>
+            <w:pStyle w:val="Inhopg2"/>
             <w:rPr>
               <w:rFonts w:eastAsiaTheme="minorEastAsia" w:cstheme="minorBidi"/>
               <w:iCs w:val="0"/>
@@ -5541,7 +5539,7 @@
         </w:p>
         <w:p>
           <w:pPr>
-            <w:pStyle w:val="TOC2"/>
+            <w:pStyle w:val="Inhopg2"/>
             <w:rPr>
               <w:rFonts w:eastAsiaTheme="minorEastAsia" w:cstheme="minorBidi"/>
               <w:iCs w:val="0"/>
@@ -5614,7 +5612,7 @@
         </w:p>
         <w:p>
           <w:pPr>
-            <w:pStyle w:val="TOC2"/>
+            <w:pStyle w:val="Inhopg2"/>
             <w:rPr>
               <w:rFonts w:eastAsiaTheme="minorEastAsia" w:cstheme="minorBidi"/>
               <w:iCs w:val="0"/>
@@ -5687,7 +5685,7 @@
         </w:p>
         <w:p>
           <w:pPr>
-            <w:pStyle w:val="TOC2"/>
+            <w:pStyle w:val="Inhopg2"/>
             <w:rPr>
               <w:rFonts w:eastAsiaTheme="minorEastAsia" w:cstheme="minorBidi"/>
               <w:iCs w:val="0"/>
@@ -5760,7 +5758,7 @@
         </w:p>
         <w:p>
           <w:pPr>
-            <w:pStyle w:val="TOC2"/>
+            <w:pStyle w:val="Inhopg2"/>
             <w:rPr>
               <w:rFonts w:eastAsiaTheme="minorEastAsia" w:cstheme="minorBidi"/>
               <w:iCs w:val="0"/>
@@ -5833,7 +5831,7 @@
         </w:p>
         <w:p>
           <w:pPr>
-            <w:pStyle w:val="TOC2"/>
+            <w:pStyle w:val="Inhopg2"/>
             <w:rPr>
               <w:rFonts w:eastAsiaTheme="minorEastAsia" w:cstheme="minorBidi"/>
               <w:iCs w:val="0"/>
@@ -5906,7 +5904,7 @@
         </w:p>
         <w:p>
           <w:pPr>
-            <w:pStyle w:val="TOC2"/>
+            <w:pStyle w:val="Inhopg2"/>
             <w:rPr>
               <w:rFonts w:eastAsiaTheme="minorEastAsia" w:cstheme="minorBidi"/>
               <w:iCs w:val="0"/>
@@ -5979,7 +5977,7 @@
         </w:p>
         <w:p>
           <w:pPr>
-            <w:pStyle w:val="TOC1"/>
+            <w:pStyle w:val="Inhopg1"/>
             <w:rPr>
               <w:rFonts w:eastAsiaTheme="minorEastAsia" w:cstheme="minorBidi"/>
               <w:b w:val="0"/>
@@ -6053,7 +6051,7 @@
         </w:p>
         <w:p>
           <w:pPr>
-            <w:pStyle w:val="TOC1"/>
+            <w:pStyle w:val="Inhopg1"/>
             <w:rPr>
               <w:rFonts w:eastAsiaTheme="minorEastAsia" w:cstheme="minorBidi"/>
               <w:b w:val="0"/>
@@ -6127,7 +6125,7 @@
         </w:p>
         <w:p>
           <w:pPr>
-            <w:pStyle w:val="TOC1"/>
+            <w:pStyle w:val="Inhopg1"/>
             <w:rPr>
               <w:rFonts w:eastAsiaTheme="minorEastAsia" w:cstheme="minorBidi"/>
               <w:b w:val="0"/>
@@ -6201,7 +6199,7 @@
         </w:p>
         <w:p>
           <w:pPr>
-            <w:pStyle w:val="TOC1"/>
+            <w:pStyle w:val="Inhopg1"/>
             <w:rPr>
               <w:rFonts w:eastAsiaTheme="minorEastAsia" w:cstheme="minorBidi"/>
               <w:b w:val="0"/>
@@ -6275,7 +6273,7 @@
         </w:p>
         <w:p>
           <w:pPr>
-            <w:pStyle w:val="TOC2"/>
+            <w:pStyle w:val="Inhopg2"/>
             <w:rPr>
               <w:rFonts w:eastAsiaTheme="minorEastAsia" w:cstheme="minorBidi"/>
               <w:iCs w:val="0"/>
@@ -6348,7 +6346,7 @@
         </w:p>
         <w:p>
           <w:pPr>
-            <w:pStyle w:val="TOC2"/>
+            <w:pStyle w:val="Inhopg2"/>
             <w:rPr>
               <w:rFonts w:eastAsiaTheme="minorEastAsia" w:cstheme="minorBidi"/>
               <w:iCs w:val="0"/>
@@ -6421,7 +6419,7 @@
         </w:p>
         <w:p>
           <w:pPr>
-            <w:pStyle w:val="TOC2"/>
+            <w:pStyle w:val="Inhopg2"/>
             <w:rPr>
               <w:rFonts w:eastAsiaTheme="minorEastAsia" w:cstheme="minorBidi"/>
               <w:iCs w:val="0"/>
@@ -6494,7 +6492,7 @@
         </w:p>
         <w:p>
           <w:pPr>
-            <w:pStyle w:val="TOC1"/>
+            <w:pStyle w:val="Inhopg1"/>
             <w:rPr>
               <w:rFonts w:eastAsiaTheme="minorEastAsia" w:cstheme="minorBidi"/>
               <w:b w:val="0"/>
@@ -6568,7 +6566,7 @@
         </w:p>
         <w:p>
           <w:pPr>
-            <w:pStyle w:val="TOC1"/>
+            <w:pStyle w:val="Inhopg1"/>
             <w:rPr>
               <w:rFonts w:eastAsiaTheme="minorEastAsia" w:cstheme="minorBidi"/>
               <w:b w:val="0"/>
@@ -6642,7 +6640,7 @@
         </w:p>
         <w:p>
           <w:pPr>
-            <w:pStyle w:val="TOC1"/>
+            <w:pStyle w:val="Inhopg1"/>
             <w:rPr>
               <w:rFonts w:eastAsiaTheme="minorEastAsia" w:cstheme="minorBidi"/>
               <w:b w:val="0"/>
@@ -6716,7 +6714,7 @@
         </w:p>
         <w:p>
           <w:pPr>
-            <w:pStyle w:val="TOC1"/>
+            <w:pStyle w:val="Inhopg1"/>
             <w:tabs>
               <w:tab w:val="clear" w:pos="9060"/>
               <w:tab w:val="right" w:leader="dot" w:pos="9601"/>
@@ -6758,7 +6756,7 @@
     </w:p>
     <w:p>
       <w:pPr>
-        <w:pStyle w:val="Heading1"/>
+        <w:pStyle w:val="Kop1"/>
         <w:spacing w:before="0"/>
         <w:rPr>
           <w:rFonts w:ascii="Arial" w:hAnsi="Arial" w:cs="Arial"/>
@@ -7186,7 +7184,7 @@
     </w:p>
     <w:p>
       <w:pPr>
-        <w:pStyle w:val="Heading1"/>
+        <w:pStyle w:val="Kop1"/>
         <w:spacing w:before="0"/>
         <w:rPr>
           <w:rFonts w:ascii="Arial" w:hAnsi="Arial" w:cs="Arial"/>
@@ -7450,7 +7448,7 @@
     </w:p>
     <w:p>
       <w:pPr>
-        <w:pStyle w:val="Heading1"/>
+        <w:pStyle w:val="Kop1"/>
         <w:rPr>
           <w:rFonts w:ascii="Arial" w:hAnsi="Arial" w:cs="Arial"/>
           <w:sz w:val="36"/>
@@ -7503,28 +7501,18 @@
         </w:rPr>
         <w:t xml:space="preserve">GitHub repository: </w:t>
       </w:r>
-      <w:r>
-        <w:fldChar w:fldCharType="begin"/>
-      </w:r>
-      <w:r>
-        <w:instrText>HYPERLINK "https://github.com/Seemlinsky/Hardware-Interfacing-project" \h</w:instrText>
-      </w:r>
-      <w:r>
-        <w:fldChar w:fldCharType="separate"/>
-      </w:r>
-      <w:r>
-        <w:rPr>
-          <w:rFonts w:ascii="Arial" w:hAnsi="Arial" w:cs="Arial"/>
-          <w:color w:val="0563C1"/>
-          <w:sz w:val="22"/>
-          <w:szCs w:val="24"/>
-          <w:u w:val="single"/>
-        </w:rPr>
-        <w:t>Hardware-Interfacing-project</w:t>
-      </w:r>
-      <w:r>
-        <w:fldChar w:fldCharType="end"/>
-      </w:r>
+      <w:hyperlink r:id="rId17">
+        <w:r>
+          <w:rPr>
+            <w:rFonts w:ascii="Arial" w:hAnsi="Arial" w:cs="Arial"/>
+            <w:color w:val="0563C1"/>
+            <w:sz w:val="22"/>
+            <w:szCs w:val="24"/>
+            <w:u w:val="single"/>
+          </w:rPr>
+          <w:t>Hardware-Interfacing-project</w:t>
+        </w:r>
+      </w:hyperlink>
     </w:p>
     <w:p>
       <w:pPr>
@@ -7545,7 +7533,7 @@
     </w:p>
     <w:tbl>
       <w:tblPr>
-        <w:tblStyle w:val="TableGrid"/>
+        <w:tblStyle w:val="Tabelraster"/>
         <w:tblW w:w="9592" w:type="dxa"/>
         <w:jc w:val="center"/>
         <w:tblLayout w:type="fixed"/>
@@ -7935,7 +7923,7 @@
     </w:tbl>
     <w:p>
       <w:pPr>
-        <w:pStyle w:val="Heading2"/>
+        <w:pStyle w:val="Kop2"/>
         <w:rPr>
           <w:rFonts w:ascii="Arial" w:hAnsi="Arial"/>
           <w:sz w:val="28"/>
@@ -8125,7 +8113,7 @@
     </w:p>
     <w:p>
       <w:pPr>
-        <w:pStyle w:val="Heading1"/>
+        <w:pStyle w:val="Kop1"/>
         <w:spacing w:before="0"/>
         <w:rPr>
           <w:rFonts w:ascii="Arial" w:hAnsi="Arial" w:cs="Arial"/>
@@ -8149,7 +8137,7 @@
     </w:p>
     <w:p>
       <w:pPr>
-        <w:pStyle w:val="Heading2"/>
+        <w:pStyle w:val="Kop2"/>
         <w:rPr>
           <w:rFonts w:ascii="Arial" w:hAnsi="Arial"/>
           <w:sz w:val="28"/>
@@ -8188,7 +8176,7 @@
     </w:p>
     <w:p>
       <w:pPr>
-        <w:pStyle w:val="Heading2"/>
+        <w:pStyle w:val="Kop2"/>
         <w:rPr>
           <w:rFonts w:ascii="Arial" w:hAnsi="Arial"/>
           <w:sz w:val="28"/>
@@ -8318,7 +8306,7 @@
     </w:p>
     <w:p>
       <w:pPr>
-        <w:pStyle w:val="Heading2"/>
+        <w:pStyle w:val="Kop2"/>
         <w:rPr>
           <w:rFonts w:ascii="Arial" w:hAnsi="Arial"/>
           <w:sz w:val="28"/>
@@ -8357,7 +8345,7 @@
     </w:p>
     <w:p>
       <w:pPr>
-        <w:pStyle w:val="Heading2"/>
+        <w:pStyle w:val="Kop2"/>
         <w:rPr>
           <w:rFonts w:ascii="Arial" w:hAnsi="Arial"/>
           <w:sz w:val="28"/>
@@ -8396,7 +8384,7 @@
     </w:p>
     <w:p>
       <w:pPr>
-        <w:pStyle w:val="Heading2"/>
+        <w:pStyle w:val="Kop2"/>
         <w:rPr>
           <w:rFonts w:ascii="Arial" w:hAnsi="Arial"/>
           <w:sz w:val="28"/>
@@ -8435,7 +8423,7 @@
     </w:p>
     <w:p>
       <w:pPr>
-        <w:pStyle w:val="Heading2"/>
+        <w:pStyle w:val="Kop2"/>
         <w:rPr>
           <w:rFonts w:ascii="Arial" w:hAnsi="Arial"/>
           <w:sz w:val="28"/>
@@ -8483,7 +8471,7 @@
     </w:p>
     <w:p>
       <w:pPr>
-        <w:pStyle w:val="Heading2"/>
+        <w:pStyle w:val="Kop2"/>
         <w:rPr>
           <w:rFonts w:ascii="Arial" w:hAnsi="Arial"/>
           <w:sz w:val="28"/>
@@ -8538,7 +8526,7 @@
                     </pic:cNvPicPr>
                   </pic:nvPicPr>
                   <pic:blipFill>
-                    <a:blip r:embed="rId17"/>
+                    <a:blip r:embed="rId18"/>
                     <a:stretch>
                       <a:fillRect/>
                     </a:stretch>
@@ -8591,6 +8579,7 @@
       <w:r>
         <w:rPr>
           <w:rFonts w:ascii="Arial" w:hAnsi="Arial" w:cs="Arial"/>
+          <w:noProof/>
           <w:sz w:val="22"/>
           <w:szCs w:val="24"/>
         </w:rPr>
@@ -8610,7 +8599,7 @@
                     <pic:cNvPicPr/>
                   </pic:nvPicPr>
                   <pic:blipFill>
-                    <a:blip r:embed="rId18"/>
+                    <a:blip r:embed="rId19"/>
                     <a:stretch>
                       <a:fillRect/>
                     </a:stretch>
@@ -8652,7 +8641,7 @@
     </w:p>
     <w:p>
       <w:pPr>
-        <w:pStyle w:val="Heading2"/>
+        <w:pStyle w:val="Kop2"/>
         <w:rPr>
           <w:rFonts w:ascii="Arial" w:hAnsi="Arial"/>
           <w:sz w:val="28"/>
@@ -8688,7 +8677,7 @@
         </w:rPr>
         <w:t xml:space="preserve">De demo-video van opdracht 1 staat op YouTube: </w:t>
       </w:r>
-      <w:hyperlink r:id="rId19">
+      <w:hyperlink r:id="rId20">
         <w:r>
           <w:rPr>
             <w:rFonts w:ascii="Arial" w:hAnsi="Arial" w:cs="Arial"/>
@@ -8703,7 +8692,7 @@
     </w:p>
     <w:p>
       <w:pPr>
-        <w:pStyle w:val="Heading2"/>
+        <w:pStyle w:val="Kop2"/>
         <w:rPr>
           <w:rFonts w:ascii="Arial" w:hAnsi="Arial"/>
           <w:sz w:val="28"/>
@@ -8739,68 +8728,58 @@
         </w:rPr>
         <w:t xml:space="preserve">De code staat online in mijn GitHub-repository. </w:t>
       </w:r>
-      <w:r>
-        <w:fldChar w:fldCharType="begin"/>
-      </w:r>
-      <w:r>
-        <w:instrText>HYPERLINK "https://github.com/Seemlinsky/Hardware-Interfacing-project/blob/main/code/eersteopdrachtide.ino" \h</w:instrText>
-      </w:r>
-      <w:r>
-        <w:fldChar w:fldCharType="separate"/>
-      </w:r>
-      <w:r>
-        <w:rPr>
-          <w:rFonts w:ascii="Arial" w:hAnsi="Arial" w:cs="Arial"/>
-          <w:color w:val="0563C1"/>
-          <w:sz w:val="24"/>
-          <w:szCs w:val="24"/>
-          <w:u w:val="single"/>
-        </w:rPr>
-        <w:t>Klik hier om de code van opdracht 1 te bekijken.</w:t>
-      </w:r>
-      <w:r>
-        <w:fldChar w:fldCharType="end"/>
-      </w:r>
-    </w:p>
-    <w:p>
-      <w:pPr>
-        <w:rPr>
-          <w:rFonts w:ascii="Arial" w:hAnsi="Arial" w:cs="Arial"/>
-          <w:sz w:val="22"/>
-          <w:szCs w:val="24"/>
-        </w:rPr>
-      </w:pPr>
-    </w:p>
-    <w:p>
-      <w:pPr>
-        <w:rPr>
-          <w:rFonts w:ascii="Arial" w:hAnsi="Arial" w:cs="Arial"/>
-          <w:sz w:val="22"/>
-          <w:szCs w:val="24"/>
-        </w:rPr>
-      </w:pPr>
-    </w:p>
-    <w:p>
-      <w:pPr>
-        <w:rPr>
-          <w:rFonts w:ascii="Arial" w:hAnsi="Arial" w:cs="Arial"/>
-          <w:sz w:val="22"/>
-          <w:szCs w:val="24"/>
-        </w:rPr>
-      </w:pPr>
-    </w:p>
-    <w:p>
-      <w:pPr>
-        <w:rPr>
-          <w:rFonts w:ascii="Arial" w:hAnsi="Arial" w:cs="Arial"/>
-          <w:sz w:val="22"/>
-          <w:szCs w:val="24"/>
-        </w:rPr>
-      </w:pPr>
-    </w:p>
-    <w:p>
-      <w:pPr>
-        <w:pStyle w:val="Heading1"/>
+      <w:hyperlink r:id="rId21">
+        <w:r>
+          <w:rPr>
+            <w:rFonts w:ascii="Arial" w:hAnsi="Arial" w:cs="Arial"/>
+            <w:color w:val="0563C1"/>
+            <w:sz w:val="24"/>
+            <w:szCs w:val="24"/>
+            <w:u w:val="single"/>
+          </w:rPr>
+          <w:t>Klik hier om de code van opdracht 1 te bekijken.</w:t>
+        </w:r>
+      </w:hyperlink>
+    </w:p>
+    <w:p>
+      <w:pPr>
+        <w:rPr>
+          <w:rFonts w:ascii="Arial" w:hAnsi="Arial" w:cs="Arial"/>
+          <w:sz w:val="22"/>
+          <w:szCs w:val="24"/>
+        </w:rPr>
+      </w:pPr>
+    </w:p>
+    <w:p>
+      <w:pPr>
+        <w:rPr>
+          <w:rFonts w:ascii="Arial" w:hAnsi="Arial" w:cs="Arial"/>
+          <w:sz w:val="22"/>
+          <w:szCs w:val="24"/>
+        </w:rPr>
+      </w:pPr>
+    </w:p>
+    <w:p>
+      <w:pPr>
+        <w:rPr>
+          <w:rFonts w:ascii="Arial" w:hAnsi="Arial" w:cs="Arial"/>
+          <w:sz w:val="22"/>
+          <w:szCs w:val="24"/>
+        </w:rPr>
+      </w:pPr>
+    </w:p>
+    <w:p>
+      <w:pPr>
+        <w:rPr>
+          <w:rFonts w:ascii="Arial" w:hAnsi="Arial" w:cs="Arial"/>
+          <w:sz w:val="22"/>
+          <w:szCs w:val="24"/>
+        </w:rPr>
+      </w:pPr>
+    </w:p>
+    <w:p>
+      <w:pPr>
+        <w:pStyle w:val="Kop1"/>
         <w:rPr>
           <w:rFonts w:ascii="Arial" w:hAnsi="Arial" w:cs="Arial"/>
           <w:sz w:val="36"/>
@@ -8823,7 +8802,7 @@
     </w:p>
     <w:p>
       <w:pPr>
-        <w:pStyle w:val="Heading2"/>
+        <w:pStyle w:val="Kop2"/>
         <w:rPr>
           <w:rFonts w:ascii="Arial" w:hAnsi="Arial"/>
           <w:sz w:val="28"/>
@@ -8862,7 +8841,7 @@
     </w:p>
     <w:p>
       <w:pPr>
-        <w:pStyle w:val="Heading2"/>
+        <w:pStyle w:val="Kop2"/>
         <w:rPr>
           <w:rFonts w:ascii="Arial" w:hAnsi="Arial"/>
           <w:sz w:val="28"/>
@@ -8992,7 +8971,7 @@
     </w:p>
     <w:p>
       <w:pPr>
-        <w:pStyle w:val="Heading2"/>
+        <w:pStyle w:val="Kop2"/>
         <w:rPr>
           <w:rFonts w:ascii="Arial" w:hAnsi="Arial"/>
           <w:sz w:val="28"/>
@@ -9031,7 +9010,7 @@
     </w:p>
     <w:p>
       <w:pPr>
-        <w:pStyle w:val="Heading2"/>
+        <w:pStyle w:val="Kop2"/>
         <w:rPr>
           <w:rFonts w:ascii="Arial" w:hAnsi="Arial"/>
           <w:sz w:val="28"/>
@@ -9070,7 +9049,7 @@
     </w:p>
     <w:p>
       <w:pPr>
-        <w:pStyle w:val="Heading2"/>
+        <w:pStyle w:val="Kop2"/>
         <w:rPr>
           <w:rFonts w:ascii="Arial" w:hAnsi="Arial"/>
           <w:sz w:val="28"/>
@@ -9109,7 +9088,7 @@
     </w:p>
     <w:p>
       <w:pPr>
-        <w:pStyle w:val="Heading2"/>
+        <w:pStyle w:val="Kop2"/>
         <w:rPr>
           <w:rFonts w:ascii="Arial" w:hAnsi="Arial"/>
           <w:sz w:val="28"/>
@@ -9166,7 +9145,7 @@
     </w:p>
     <w:p>
       <w:pPr>
-        <w:pStyle w:val="Heading2"/>
+        <w:pStyle w:val="Kop2"/>
         <w:rPr>
           <w:rFonts w:ascii="Arial" w:hAnsi="Arial"/>
           <w:sz w:val="28"/>
@@ -9221,7 +9200,7 @@
                     </pic:cNvPicPr>
                   </pic:nvPicPr>
                   <pic:blipFill>
-                    <a:blip r:embed="rId20"/>
+                    <a:blip r:embed="rId22"/>
                     <a:stretch>
                       <a:fillRect/>
                     </a:stretch>
@@ -9274,6 +9253,7 @@
       <w:r>
         <w:rPr>
           <w:rFonts w:ascii="Arial" w:hAnsi="Arial" w:cs="Arial"/>
+          <w:noProof/>
           <w:sz w:val="22"/>
           <w:szCs w:val="24"/>
         </w:rPr>
@@ -9293,7 +9273,7 @@
                     <pic:cNvPicPr/>
                   </pic:nvPicPr>
                   <pic:blipFill>
-                    <a:blip r:embed="rId21"/>
+                    <a:blip r:embed="rId23"/>
                     <a:stretch>
                       <a:fillRect/>
                     </a:stretch>
@@ -9335,7 +9315,7 @@
     </w:p>
     <w:p>
       <w:pPr>
-        <w:pStyle w:val="Heading2"/>
+        <w:pStyle w:val="Kop2"/>
         <w:rPr>
           <w:rFonts w:ascii="Arial" w:hAnsi="Arial"/>
           <w:sz w:val="28"/>
@@ -9371,7 +9351,7 @@
         </w:rPr>
         <w:t xml:space="preserve">De demo-video van opdracht 2 staat op YouTube: </w:t>
       </w:r>
-      <w:hyperlink r:id="rId22">
+      <w:hyperlink r:id="rId24">
         <w:r>
           <w:rPr>
             <w:rFonts w:ascii="Arial" w:hAnsi="Arial" w:cs="Arial"/>
@@ -9386,7 +9366,7 @@
     </w:p>
     <w:p>
       <w:pPr>
-        <w:pStyle w:val="Heading2"/>
+        <w:pStyle w:val="Kop2"/>
         <w:rPr>
           <w:rFonts w:ascii="Arial" w:hAnsi="Arial"/>
           <w:sz w:val="28"/>
@@ -9422,28 +9402,18 @@
         </w:rPr>
         <w:t xml:space="preserve">De code staat online in mijn GitHub-repository. </w:t>
       </w:r>
-      <w:r>
-        <w:fldChar w:fldCharType="begin"/>
-      </w:r>
-      <w:r>
-        <w:instrText>HYPERLINK "https://github.com/Seemlinsky/Hardware-Interfacing-project/blob/main/code/tweedeopdrachtide.ino" \h</w:instrText>
-      </w:r>
-      <w:r>
-        <w:fldChar w:fldCharType="separate"/>
-      </w:r>
-      <w:r>
-        <w:rPr>
-          <w:rFonts w:ascii="Arial" w:hAnsi="Arial" w:cs="Arial"/>
-          <w:color w:val="0563C1"/>
-          <w:sz w:val="24"/>
-          <w:szCs w:val="24"/>
-          <w:u w:val="single"/>
-        </w:rPr>
-        <w:t>Klik hier om de code van opdracht 2 te bekijken.</w:t>
-      </w:r>
-      <w:r>
-        <w:fldChar w:fldCharType="end"/>
-      </w:r>
+      <w:hyperlink r:id="rId25">
+        <w:r>
+          <w:rPr>
+            <w:rFonts w:ascii="Arial" w:hAnsi="Arial" w:cs="Arial"/>
+            <w:color w:val="0563C1"/>
+            <w:sz w:val="24"/>
+            <w:szCs w:val="24"/>
+            <w:u w:val="single"/>
+          </w:rPr>
+          <w:t>Klik hier om de code van opdracht 2 te bekijken.</w:t>
+        </w:r>
+      </w:hyperlink>
     </w:p>
     <w:p>
       <w:pPr>
@@ -9465,7 +9435,7 @@
     </w:p>
     <w:p>
       <w:pPr>
-        <w:pStyle w:val="Heading1"/>
+        <w:pStyle w:val="Kop1"/>
         <w:rPr>
           <w:rFonts w:ascii="Arial" w:hAnsi="Arial" w:cs="Arial"/>
           <w:sz w:val="36"/>
@@ -9488,7 +9458,7 @@
     </w:p>
     <w:p>
       <w:pPr>
-        <w:pStyle w:val="Heading2"/>
+        <w:pStyle w:val="Kop2"/>
         <w:rPr>
           <w:rFonts w:ascii="Arial" w:hAnsi="Arial"/>
           <w:sz w:val="28"/>
@@ -9527,7 +9497,7 @@
     </w:p>
     <w:p>
       <w:pPr>
-        <w:pStyle w:val="Heading2"/>
+        <w:pStyle w:val="Kop2"/>
         <w:rPr>
           <w:rFonts w:ascii="Arial" w:hAnsi="Arial"/>
           <w:sz w:val="28"/>
@@ -9693,7 +9663,7 @@
     </w:p>
     <w:p>
       <w:pPr>
-        <w:pStyle w:val="Heading2"/>
+        <w:pStyle w:val="Kop2"/>
         <w:rPr>
           <w:rFonts w:ascii="Arial" w:hAnsi="Arial"/>
           <w:sz w:val="28"/>
@@ -9732,7 +9702,7 @@
     </w:p>
     <w:p>
       <w:pPr>
-        <w:pStyle w:val="Heading2"/>
+        <w:pStyle w:val="Kop2"/>
         <w:rPr>
           <w:rFonts w:ascii="Arial" w:hAnsi="Arial"/>
           <w:sz w:val="28"/>
@@ -9771,7 +9741,7 @@
     </w:p>
     <w:p>
       <w:pPr>
-        <w:pStyle w:val="Heading2"/>
+        <w:pStyle w:val="Kop2"/>
         <w:rPr>
           <w:rFonts w:ascii="Arial" w:hAnsi="Arial"/>
           <w:sz w:val="28"/>
@@ -9810,7 +9780,7 @@
     </w:p>
     <w:p>
       <w:pPr>
-        <w:pStyle w:val="Heading2"/>
+        <w:pStyle w:val="Kop2"/>
         <w:rPr>
           <w:rFonts w:ascii="Arial" w:hAnsi="Arial"/>
           <w:sz w:val="28"/>
@@ -9849,7 +9819,7 @@
     </w:p>
     <w:p>
       <w:pPr>
-        <w:pStyle w:val="Heading2"/>
+        <w:pStyle w:val="Kop2"/>
         <w:rPr>
           <w:rFonts w:ascii="Arial" w:hAnsi="Arial"/>
           <w:sz w:val="28"/>
@@ -9904,7 +9874,7 @@
                     </pic:cNvPicPr>
                   </pic:nvPicPr>
                   <pic:blipFill>
-                    <a:blip r:embed="rId23"/>
+                    <a:blip r:embed="rId26"/>
                     <a:stretch>
                       <a:fillRect/>
                     </a:stretch>
@@ -9957,14 +9927,15 @@
       <w:r>
         <w:rPr>
           <w:rFonts w:ascii="Arial" w:hAnsi="Arial" w:cs="Arial"/>
+          <w:noProof/>
           <w:sz w:val="22"/>
           <w:szCs w:val="24"/>
         </w:rPr>
         <w:drawing>
-          <wp:inline distT="0" distB="0" distL="0" distR="0" wp14:anchorId="18A13AF7" wp14:editId="7035B85E">
-            <wp:extent cx="6097270" cy="3131820"/>
-            <wp:effectExtent l="0" t="0" r="0" b="0"/>
-            <wp:docPr id="1548483291" name="Picture 1"/>
+          <wp:inline distT="0" distB="0" distL="0" distR="0" wp14:anchorId="7695BE2B" wp14:editId="719D59F4">
+            <wp:extent cx="6508054" cy="3621974"/>
+            <wp:effectExtent l="0" t="0" r="7620" b="0"/>
+            <wp:docPr id="1172046093" name="Afbeelding 4"/>
             <wp:cNvGraphicFramePr>
               <a:graphicFrameLocks xmlns:a="http://schemas.openxmlformats.org/drawingml/2006/main" noChangeAspect="1"/>
             </wp:cNvGraphicFramePr>
@@ -9972,23 +9943,33 @@
               <a:graphicData uri="http://schemas.openxmlformats.org/drawingml/2006/picture">
                 <pic:pic xmlns:pic="http://schemas.openxmlformats.org/drawingml/2006/picture">
                   <pic:nvPicPr>
-                    <pic:cNvPr id="1548483291" name=""/>
-                    <pic:cNvPicPr/>
+                    <pic:cNvPr id="0" name="Picture 3"/>
+                    <pic:cNvPicPr>
+                      <a:picLocks noChangeAspect="1" noChangeArrowheads="1"/>
+                    </pic:cNvPicPr>
                   </pic:nvPicPr>
                   <pic:blipFill>
-                    <a:blip r:embed="rId24"/>
+                    <a:blip r:embed="rId27" cstate="print">
+                      <a:extLst>
+                        <a:ext uri="{28A0092B-C50C-407E-A947-70E740481C1C}">
+                          <a14:useLocalDpi xmlns:a14="http://schemas.microsoft.com/office/drawing/2010/main" val="0"/>
+                        </a:ext>
+                      </a:extLst>
+                    </a:blip>
+                    <a:srcRect/>
                     <a:stretch>
                       <a:fillRect/>
                     </a:stretch>
                   </pic:blipFill>
-                  <pic:spPr>
+                  <pic:spPr bwMode="auto">
                     <a:xfrm>
                       <a:off x="0" y="0"/>
-                      <a:ext cx="6097270" cy="3131820"/>
+                      <a:ext cx="6529745" cy="3634046"/>
                     </a:xfrm>
                     <a:prstGeom prst="rect">
                       <a:avLst/>
                     </a:prstGeom>
+                    <a:noFill/>
                   </pic:spPr>
                 </pic:pic>
               </a:graphicData>
@@ -10018,7 +9999,7 @@
     </w:p>
     <w:p>
       <w:pPr>
-        <w:pStyle w:val="Heading2"/>
+        <w:pStyle w:val="Kop2"/>
         <w:rPr>
           <w:rFonts w:ascii="Arial" w:hAnsi="Arial"/>
           <w:sz w:val="28"/>
@@ -10054,7 +10035,7 @@
         </w:rPr>
         <w:t xml:space="preserve">De demo-video van opdracht 3 staat op YouTube: </w:t>
       </w:r>
-      <w:hyperlink r:id="rId25">
+      <w:hyperlink r:id="rId28">
         <w:r>
           <w:rPr>
             <w:rFonts w:ascii="Arial" w:hAnsi="Arial" w:cs="Arial"/>
@@ -10069,7 +10050,7 @@
     </w:p>
     <w:p>
       <w:pPr>
-        <w:pStyle w:val="Heading2"/>
+        <w:pStyle w:val="Kop2"/>
         <w:rPr>
           <w:rFonts w:ascii="Arial" w:hAnsi="Arial"/>
           <w:sz w:val="28"/>
@@ -10105,28 +10086,18 @@
         </w:rPr>
         <w:t xml:space="preserve">De code staat online in mijn GitHub-repository. </w:t>
       </w:r>
-      <w:r>
-        <w:fldChar w:fldCharType="begin"/>
-      </w:r>
-      <w:r>
-        <w:instrText>HYPERLINK "https://github.com/Seemlinsky/Hardware-Interfacing-project/blob/main/code/derdeopdrachtide.ino" \h</w:instrText>
-      </w:r>
-      <w:r>
-        <w:fldChar w:fldCharType="separate"/>
-      </w:r>
-      <w:r>
-        <w:rPr>
-          <w:rFonts w:ascii="Arial" w:hAnsi="Arial" w:cs="Arial"/>
-          <w:color w:val="0563C1"/>
-          <w:sz w:val="24"/>
-          <w:szCs w:val="24"/>
-          <w:u w:val="single"/>
-        </w:rPr>
-        <w:t>Klik hier om de code van opdracht 3 te bekijken.</w:t>
-      </w:r>
-      <w:r>
-        <w:fldChar w:fldCharType="end"/>
-      </w:r>
+      <w:hyperlink r:id="rId29">
+        <w:r>
+          <w:rPr>
+            <w:rFonts w:ascii="Arial" w:hAnsi="Arial" w:cs="Arial"/>
+            <w:color w:val="0563C1"/>
+            <w:sz w:val="24"/>
+            <w:szCs w:val="24"/>
+            <w:u w:val="single"/>
+          </w:rPr>
+          <w:t>Klik hier om de code van opdracht 3 te bekijken.</w:t>
+        </w:r>
+      </w:hyperlink>
     </w:p>
     <w:p>
       <w:pPr>
@@ -10190,7 +10161,7 @@
     </w:p>
     <w:p>
       <w:pPr>
-        <w:pStyle w:val="Heading1"/>
+        <w:pStyle w:val="Kop1"/>
         <w:rPr>
           <w:rFonts w:ascii="Arial" w:hAnsi="Arial" w:cs="Arial"/>
           <w:sz w:val="36"/>
@@ -10212,7 +10183,7 @@
     </w:p>
     <w:p>
       <w:pPr>
-        <w:pStyle w:val="Heading2"/>
+        <w:pStyle w:val="Kop2"/>
         <w:rPr>
           <w:rFonts w:ascii="Arial" w:hAnsi="Arial"/>
           <w:sz w:val="28"/>
@@ -10251,7 +10222,7 @@
     </w:p>
     <w:p>
       <w:pPr>
-        <w:pStyle w:val="Heading2"/>
+        <w:pStyle w:val="Kop2"/>
         <w:rPr>
           <w:rFonts w:ascii="Arial" w:hAnsi="Arial"/>
           <w:sz w:val="28"/>
@@ -10399,7 +10370,7 @@
     </w:p>
     <w:p>
       <w:pPr>
-        <w:pStyle w:val="Heading2"/>
+        <w:pStyle w:val="Kop2"/>
         <w:rPr>
           <w:rFonts w:ascii="Arial" w:hAnsi="Arial"/>
           <w:sz w:val="28"/>
@@ -10438,7 +10409,7 @@
     </w:p>
     <w:p>
       <w:pPr>
-        <w:pStyle w:val="Heading2"/>
+        <w:pStyle w:val="Kop2"/>
         <w:rPr>
           <w:rFonts w:ascii="Arial" w:hAnsi="Arial"/>
           <w:sz w:val="28"/>
@@ -10477,7 +10448,7 @@
     </w:p>
     <w:p>
       <w:pPr>
-        <w:pStyle w:val="Heading2"/>
+        <w:pStyle w:val="Kop2"/>
         <w:rPr>
           <w:rFonts w:ascii="Arial" w:hAnsi="Arial"/>
           <w:sz w:val="28"/>
@@ -10516,7 +10487,7 @@
     </w:p>
     <w:p>
       <w:pPr>
-        <w:pStyle w:val="Heading2"/>
+        <w:pStyle w:val="Kop2"/>
         <w:rPr>
           <w:rFonts w:ascii="Arial" w:hAnsi="Arial"/>
           <w:sz w:val="28"/>
@@ -10555,7 +10526,7 @@
     </w:p>
     <w:p>
       <w:pPr>
-        <w:pStyle w:val="Heading2"/>
+        <w:pStyle w:val="Kop2"/>
         <w:rPr>
           <w:rFonts w:ascii="Arial" w:hAnsi="Arial"/>
           <w:sz w:val="28"/>
@@ -10610,7 +10581,7 @@
                     </pic:cNvPicPr>
                   </pic:nvPicPr>
                   <pic:blipFill>
-                    <a:blip r:embed="rId26"/>
+                    <a:blip r:embed="rId30"/>
                     <a:stretch>
                       <a:fillRect/>
                     </a:stretch>
@@ -10663,14 +10634,15 @@
       <w:r>
         <w:rPr>
           <w:rFonts w:ascii="Arial" w:hAnsi="Arial" w:cs="Arial"/>
+          <w:noProof/>
           <w:sz w:val="22"/>
           <w:szCs w:val="24"/>
         </w:rPr>
         <w:drawing>
-          <wp:inline distT="0" distB="0" distL="0" distR="0" wp14:anchorId="30F0057B" wp14:editId="393DF097">
-            <wp:extent cx="6097270" cy="3141345"/>
-            <wp:effectExtent l="0" t="0" r="0" b="1905"/>
-            <wp:docPr id="1813270703" name="Picture 1"/>
+          <wp:inline distT="0" distB="0" distL="0" distR="0" wp14:anchorId="5B63381C" wp14:editId="32E4D1D3">
+            <wp:extent cx="5664530" cy="4126511"/>
+            <wp:effectExtent l="0" t="0" r="0" b="7620"/>
+            <wp:docPr id="1938618814" name="Afbeelding 2"/>
             <wp:cNvGraphicFramePr>
               <a:graphicFrameLocks xmlns:a="http://schemas.openxmlformats.org/drawingml/2006/main" noChangeAspect="1"/>
             </wp:cNvGraphicFramePr>
@@ -10678,23 +10650,33 @@
               <a:graphicData uri="http://schemas.openxmlformats.org/drawingml/2006/picture">
                 <pic:pic xmlns:pic="http://schemas.openxmlformats.org/drawingml/2006/picture">
                   <pic:nvPicPr>
-                    <pic:cNvPr id="1813270703" name=""/>
-                    <pic:cNvPicPr/>
+                    <pic:cNvPr id="0" name="Picture 2"/>
+                    <pic:cNvPicPr>
+                      <a:picLocks noChangeAspect="1" noChangeArrowheads="1"/>
+                    </pic:cNvPicPr>
                   </pic:nvPicPr>
                   <pic:blipFill>
-                    <a:blip r:embed="rId27"/>
+                    <a:blip r:embed="rId31">
+                      <a:extLst>
+                        <a:ext uri="{28A0092B-C50C-407E-A947-70E740481C1C}">
+                          <a14:useLocalDpi xmlns:a14="http://schemas.microsoft.com/office/drawing/2010/main" val="0"/>
+                        </a:ext>
+                      </a:extLst>
+                    </a:blip>
+                    <a:srcRect/>
                     <a:stretch>
                       <a:fillRect/>
                     </a:stretch>
                   </pic:blipFill>
-                  <pic:spPr>
+                  <pic:spPr bwMode="auto">
                     <a:xfrm>
                       <a:off x="0" y="0"/>
-                      <a:ext cx="6097270" cy="3141345"/>
+                      <a:ext cx="5703326" cy="4154773"/>
                     </a:xfrm>
                     <a:prstGeom prst="rect">
                       <a:avLst/>
                     </a:prstGeom>
+                    <a:noFill/>
                   </pic:spPr>
                 </pic:pic>
               </a:graphicData>
@@ -10724,7 +10706,7 @@
     </w:p>
     <w:p>
       <w:pPr>
-        <w:pStyle w:val="Heading2"/>
+        <w:pStyle w:val="Kop2"/>
         <w:rPr>
           <w:rFonts w:ascii="Arial" w:hAnsi="Arial"/>
           <w:sz w:val="28"/>
@@ -10760,7 +10742,7 @@
         </w:rPr>
         <w:t xml:space="preserve">De demo-video van opdracht 4 staat op YouTube: </w:t>
       </w:r>
-      <w:hyperlink r:id="rId28">
+      <w:hyperlink r:id="rId32">
         <w:r>
           <w:rPr>
             <w:rFonts w:ascii="Arial" w:hAnsi="Arial" w:cs="Arial"/>
@@ -10775,7 +10757,7 @@
     </w:p>
     <w:p>
       <w:pPr>
-        <w:pStyle w:val="Heading2"/>
+        <w:pStyle w:val="Kop2"/>
         <w:rPr>
           <w:rFonts w:ascii="Arial" w:hAnsi="Arial"/>
           <w:sz w:val="28"/>
@@ -10811,50 +10793,22 @@
         </w:rPr>
         <w:t xml:space="preserve">De code staat online in mijn GitHub-repository. </w:t>
       </w:r>
-      <w:r>
-        <w:fldChar w:fldCharType="begin"/>
-      </w:r>
-      <w:r>
-        <w:instrText>HYPERLINK "https://github.com/Seemlinsky/Hardware-Interfacing-project/blob/main/code/vierdeopdrachtide.ino" \h</w:instrText>
-      </w:r>
-      <w:r>
-        <w:fldChar w:fldCharType="separate"/>
-      </w:r>
-      <w:r>
-        <w:rPr>
-          <w:rFonts w:ascii="Arial" w:hAnsi="Arial" w:cs="Arial"/>
-          <w:color w:val="0563C1"/>
-          <w:sz w:val="24"/>
-          <w:szCs w:val="24"/>
-          <w:u w:val="single"/>
-        </w:rPr>
-        <w:t>Klik hier om de code van opdracht 4 te bekijken.</w:t>
-      </w:r>
-      <w:r>
-        <w:fldChar w:fldCharType="end"/>
-      </w:r>
-    </w:p>
-    <w:p>
-      <w:pPr>
-        <w:spacing w:after="0" w:line="240" w:lineRule="auto"/>
-        <w:rPr>
-          <w:rFonts w:ascii="Arial" w:hAnsi="Arial" w:cs="Arial"/>
-          <w:sz w:val="22"/>
-          <w:szCs w:val="24"/>
-        </w:rPr>
-      </w:pPr>
-      <w:r>
-        <w:rPr>
-          <w:rFonts w:ascii="Arial" w:hAnsi="Arial" w:cs="Arial"/>
-          <w:sz w:val="22"/>
-          <w:szCs w:val="24"/>
-        </w:rPr>
-        <w:br w:type="page"/>
-      </w:r>
-    </w:p>
-    <w:p>
-      <w:pPr>
-        <w:pStyle w:val="Heading1"/>
+      <w:hyperlink r:id="rId33">
+        <w:r>
+          <w:rPr>
+            <w:rFonts w:ascii="Arial" w:hAnsi="Arial" w:cs="Arial"/>
+            <w:color w:val="0563C1"/>
+            <w:sz w:val="24"/>
+            <w:szCs w:val="24"/>
+            <w:u w:val="single"/>
+          </w:rPr>
+          <w:t>Klik hier om de code van opdracht 4 te bekijken.</w:t>
+        </w:r>
+      </w:hyperlink>
+    </w:p>
+    <w:p>
+      <w:pPr>
+        <w:pStyle w:val="Kop1"/>
         <w:rPr>
           <w:rFonts w:ascii="Arial" w:hAnsi="Arial" w:cs="Arial"/>
           <w:sz w:val="36"/>
@@ -10877,7 +10831,7 @@
     </w:p>
     <w:p>
       <w:pPr>
-        <w:pStyle w:val="Heading2"/>
+        <w:pStyle w:val="Kop2"/>
         <w:rPr>
           <w:rFonts w:ascii="Arial" w:hAnsi="Arial"/>
           <w:sz w:val="28"/>
@@ -10916,7 +10870,7 @@
     </w:p>
     <w:p>
       <w:pPr>
-        <w:pStyle w:val="Heading2"/>
+        <w:pStyle w:val="Kop2"/>
         <w:rPr>
           <w:rFonts w:ascii="Arial" w:hAnsi="Arial"/>
           <w:sz w:val="28"/>
@@ -11064,7 +11018,7 @@
     </w:p>
     <w:p>
       <w:pPr>
-        <w:pStyle w:val="Heading2"/>
+        <w:pStyle w:val="Kop2"/>
         <w:rPr>
           <w:rFonts w:ascii="Arial" w:hAnsi="Arial"/>
           <w:sz w:val="28"/>
@@ -11103,7 +11057,7 @@
     </w:p>
     <w:p>
       <w:pPr>
-        <w:pStyle w:val="Heading2"/>
+        <w:pStyle w:val="Kop2"/>
         <w:rPr>
           <w:rFonts w:ascii="Arial" w:hAnsi="Arial"/>
           <w:sz w:val="28"/>
@@ -11142,7 +11096,7 @@
     </w:p>
     <w:p>
       <w:pPr>
-        <w:pStyle w:val="Heading2"/>
+        <w:pStyle w:val="Kop2"/>
         <w:rPr>
           <w:rFonts w:ascii="Arial" w:hAnsi="Arial"/>
           <w:sz w:val="28"/>
@@ -11181,7 +11135,7 @@
     </w:p>
     <w:p>
       <w:pPr>
-        <w:pStyle w:val="Heading2"/>
+        <w:pStyle w:val="Kop2"/>
         <w:rPr>
           <w:rFonts w:ascii="Arial" w:hAnsi="Arial"/>
           <w:sz w:val="28"/>
@@ -11220,7 +11174,7 @@
     </w:p>
     <w:p>
       <w:pPr>
-        <w:pStyle w:val="Heading2"/>
+        <w:pStyle w:val="Kop2"/>
         <w:rPr>
           <w:rFonts w:ascii="Arial" w:hAnsi="Arial"/>
           <w:sz w:val="28"/>
@@ -11275,7 +11229,7 @@
                     </pic:cNvPicPr>
                   </pic:nvPicPr>
                   <pic:blipFill>
-                    <a:blip r:embed="rId29"/>
+                    <a:blip r:embed="rId34"/>
                     <a:stretch>
                       <a:fillRect/>
                     </a:stretch>
@@ -11328,6 +11282,7 @@
       <w:r>
         <w:rPr>
           <w:rFonts w:ascii="Arial" w:hAnsi="Arial" w:cs="Arial"/>
+          <w:noProof/>
           <w:sz w:val="22"/>
           <w:szCs w:val="24"/>
         </w:rPr>
@@ -11347,7 +11302,7 @@
                     <pic:cNvPicPr/>
                   </pic:nvPicPr>
                   <pic:blipFill>
-                    <a:blip r:embed="rId30"/>
+                    <a:blip r:embed="rId35"/>
                     <a:stretch>
                       <a:fillRect/>
                     </a:stretch>
@@ -11389,7 +11344,7 @@
     </w:p>
     <w:p>
       <w:pPr>
-        <w:pStyle w:val="Heading2"/>
+        <w:pStyle w:val="Kop2"/>
         <w:rPr>
           <w:rFonts w:ascii="Arial" w:hAnsi="Arial"/>
           <w:sz w:val="28"/>
@@ -11425,7 +11380,7 @@
         </w:rPr>
         <w:t xml:space="preserve">De demo-video van opdracht 5 staat op YouTube: </w:t>
       </w:r>
-      <w:hyperlink r:id="rId31">
+      <w:hyperlink r:id="rId36">
         <w:r>
           <w:rPr>
             <w:rFonts w:ascii="Arial" w:hAnsi="Arial" w:cs="Arial"/>
@@ -11440,7 +11395,7 @@
     </w:p>
     <w:p>
       <w:pPr>
-        <w:pStyle w:val="Heading2"/>
+        <w:pStyle w:val="Kop2"/>
         <w:rPr>
           <w:rFonts w:ascii="Arial" w:hAnsi="Arial"/>
           <w:sz w:val="28"/>
@@ -11476,28 +11431,18 @@
         </w:rPr>
         <w:t xml:space="preserve">De code staat online in mijn GitHub-repository. </w:t>
       </w:r>
-      <w:r>
-        <w:fldChar w:fldCharType="begin"/>
-      </w:r>
-      <w:r>
-        <w:instrText>HYPERLINK "https://github.com/Seemlinsky/Hardware-Interfacing-project/blob/main/code/vijfdeopdrachtide.ino" \h</w:instrText>
-      </w:r>
-      <w:r>
-        <w:fldChar w:fldCharType="separate"/>
-      </w:r>
-      <w:r>
-        <w:rPr>
-          <w:rFonts w:ascii="Arial" w:hAnsi="Arial" w:cs="Arial"/>
-          <w:color w:val="0563C1"/>
-          <w:sz w:val="24"/>
-          <w:szCs w:val="24"/>
-          <w:u w:val="single"/>
-        </w:rPr>
-        <w:t>Klik hier om de code van opdracht 5 te bekijken.</w:t>
-      </w:r>
-      <w:r>
-        <w:fldChar w:fldCharType="end"/>
-      </w:r>
+      <w:hyperlink r:id="rId37">
+        <w:r>
+          <w:rPr>
+            <w:rFonts w:ascii="Arial" w:hAnsi="Arial" w:cs="Arial"/>
+            <w:color w:val="0563C1"/>
+            <w:sz w:val="24"/>
+            <w:szCs w:val="24"/>
+            <w:u w:val="single"/>
+          </w:rPr>
+          <w:t>Klik hier om de code van opdracht 5 te bekijken.</w:t>
+        </w:r>
+      </w:hyperlink>
     </w:p>
     <w:p>
       <w:pPr>
@@ -11519,7 +11464,7 @@
     </w:p>
     <w:p>
       <w:pPr>
-        <w:pStyle w:val="Heading1"/>
+        <w:pStyle w:val="Kop1"/>
         <w:rPr>
           <w:rFonts w:ascii="Arial" w:hAnsi="Arial" w:cs="Arial"/>
           <w:sz w:val="36"/>
@@ -11542,7 +11487,7 @@
     </w:p>
     <w:p>
       <w:pPr>
-        <w:pStyle w:val="Heading2"/>
+        <w:pStyle w:val="Kop2"/>
         <w:rPr>
           <w:rFonts w:ascii="Arial" w:hAnsi="Arial"/>
           <w:sz w:val="28"/>
@@ -11581,7 +11526,7 @@
     </w:p>
     <w:p>
       <w:pPr>
-        <w:pStyle w:val="Heading2"/>
+        <w:pStyle w:val="Kop2"/>
         <w:rPr>
           <w:rFonts w:ascii="Arial" w:hAnsi="Arial"/>
           <w:sz w:val="28"/>
@@ -11674,19 +11619,28 @@
           <w:szCs w:val="24"/>
           <w:lang w:val="en-GB"/>
         </w:rPr>
-        <w:t xml:space="preserve">• 1x </w:t>
-      </w:r>
-      <w:proofErr w:type="spellStart"/>
-      <w:r>
+        <w:t>• 1x joystickmodule</w:t>
+      </w:r>
+    </w:p>
+    <w:p>
+      <w:pPr>
+        <w:ind w:left="360"/>
         <w:rPr>
           <w:rFonts w:ascii="Arial" w:hAnsi="Arial" w:cs="Arial"/>
           <w:sz w:val="22"/>
           <w:szCs w:val="24"/>
           <w:lang w:val="en-GB"/>
         </w:rPr>
-        <w:t>joystickmodule</w:t>
-      </w:r>
-      <w:proofErr w:type="spellEnd"/>
+      </w:pPr>
+      <w:r>
+        <w:rPr>
+          <w:rFonts w:ascii="Arial" w:hAnsi="Arial" w:cs="Arial"/>
+          <w:sz w:val="22"/>
+          <w:szCs w:val="24"/>
+          <w:lang w:val="en-GB"/>
+        </w:rPr>
+        <w:t>• 8x jumper wires</w:t>
+      </w:r>
     </w:p>
     <w:p>
       <w:pPr>
@@ -11695,26 +11649,6 @@
           <w:rFonts w:ascii="Arial" w:hAnsi="Arial" w:cs="Arial"/>
           <w:sz w:val="22"/>
           <w:szCs w:val="24"/>
-          <w:lang w:val="en-GB"/>
-        </w:rPr>
-      </w:pPr>
-      <w:r>
-        <w:rPr>
-          <w:rFonts w:ascii="Arial" w:hAnsi="Arial" w:cs="Arial"/>
-          <w:sz w:val="22"/>
-          <w:szCs w:val="24"/>
-          <w:lang w:val="en-GB"/>
-        </w:rPr>
-        <w:t>• 8x jumper wires</w:t>
-      </w:r>
-    </w:p>
-    <w:p>
-      <w:pPr>
-        <w:ind w:left="360"/>
-        <w:rPr>
-          <w:rFonts w:ascii="Arial" w:hAnsi="Arial" w:cs="Arial"/>
-          <w:sz w:val="22"/>
-          <w:szCs w:val="24"/>
         </w:rPr>
       </w:pPr>
       <w:r>
@@ -11728,7 +11662,7 @@
     </w:p>
     <w:p>
       <w:pPr>
-        <w:pStyle w:val="Heading2"/>
+        <w:pStyle w:val="Kop2"/>
         <w:rPr>
           <w:rFonts w:ascii="Arial" w:hAnsi="Arial"/>
           <w:sz w:val="28"/>
@@ -11767,7 +11701,7 @@
     </w:p>
     <w:p>
       <w:pPr>
-        <w:pStyle w:val="Heading2"/>
+        <w:pStyle w:val="Kop2"/>
         <w:rPr>
           <w:rFonts w:ascii="Arial" w:hAnsi="Arial"/>
           <w:sz w:val="28"/>
@@ -11806,7 +11740,7 @@
     </w:p>
     <w:p>
       <w:pPr>
-        <w:pStyle w:val="Heading2"/>
+        <w:pStyle w:val="Kop2"/>
         <w:rPr>
           <w:rFonts w:ascii="Arial" w:hAnsi="Arial"/>
           <w:sz w:val="28"/>
@@ -11845,7 +11779,7 @@
     </w:p>
     <w:p>
       <w:pPr>
-        <w:pStyle w:val="Heading2"/>
+        <w:pStyle w:val="Kop2"/>
         <w:rPr>
           <w:rFonts w:ascii="Arial" w:hAnsi="Arial"/>
           <w:sz w:val="28"/>
@@ -11884,7 +11818,7 @@
     </w:p>
     <w:p>
       <w:pPr>
-        <w:pStyle w:val="Heading2"/>
+        <w:pStyle w:val="Kop2"/>
         <w:rPr>
           <w:rFonts w:ascii="Arial" w:hAnsi="Arial"/>
           <w:sz w:val="28"/>
@@ -11939,7 +11873,7 @@
                     </pic:cNvPicPr>
                   </pic:nvPicPr>
                   <pic:blipFill>
-                    <a:blip r:embed="rId32"/>
+                    <a:blip r:embed="rId38"/>
                     <a:stretch>
                       <a:fillRect/>
                     </a:stretch>
@@ -11992,6 +11926,7 @@
       <w:r>
         <w:rPr>
           <w:rFonts w:ascii="Arial" w:hAnsi="Arial" w:cs="Arial"/>
+          <w:noProof/>
           <w:sz w:val="22"/>
           <w:szCs w:val="24"/>
         </w:rPr>
@@ -12011,7 +11946,7 @@
                     <pic:cNvPicPr/>
                   </pic:nvPicPr>
                   <pic:blipFill>
-                    <a:blip r:embed="rId33"/>
+                    <a:blip r:embed="rId39"/>
                     <a:stretch>
                       <a:fillRect/>
                     </a:stretch>
@@ -12053,7 +11988,7 @@
     </w:p>
     <w:p>
       <w:pPr>
-        <w:pStyle w:val="Heading2"/>
+        <w:pStyle w:val="Kop2"/>
         <w:rPr>
           <w:rFonts w:ascii="Arial" w:hAnsi="Arial"/>
           <w:sz w:val="28"/>
@@ -12089,7 +12024,7 @@
         </w:rPr>
         <w:t xml:space="preserve">De demo-video van opdracht 6 staat op YouTube: </w:t>
       </w:r>
-      <w:hyperlink r:id="rId34">
+      <w:hyperlink r:id="rId40">
         <w:r>
           <w:rPr>
             <w:rFonts w:ascii="Arial" w:hAnsi="Arial" w:cs="Arial"/>
@@ -12104,7 +12039,7 @@
     </w:p>
     <w:p>
       <w:pPr>
-        <w:pStyle w:val="Heading2"/>
+        <w:pStyle w:val="Kop2"/>
         <w:rPr>
           <w:rFonts w:ascii="Arial" w:hAnsi="Arial"/>
           <w:sz w:val="28"/>
@@ -12140,7 +12075,7 @@
         </w:rPr>
         <w:t xml:space="preserve">De code staat online in mijn GitHub-repository. </w:t>
       </w:r>
-      <w:hyperlink r:id="rId35">
+      <w:hyperlink r:id="rId41">
         <w:r>
           <w:rPr>
             <w:rFonts w:ascii="Arial" w:hAnsi="Arial" w:cs="Arial"/>
@@ -12173,7 +12108,7 @@
     </w:p>
     <w:p>
       <w:pPr>
-        <w:pStyle w:val="Heading1"/>
+        <w:pStyle w:val="Kop1"/>
         <w:rPr>
           <w:rFonts w:ascii="Arial" w:hAnsi="Arial" w:cs="Arial"/>
           <w:sz w:val="36"/>
@@ -12213,7 +12148,7 @@
     </w:p>
     <w:tbl>
       <w:tblPr>
-        <w:tblStyle w:val="TableGrid"/>
+        <w:tblStyle w:val="Tabelraster"/>
         <w:tblW w:w="9901" w:type="dxa"/>
         <w:jc w:val="center"/>
         <w:tblLayout w:type="fixed"/>
@@ -12432,7 +12367,7 @@
                 <w:szCs w:val="24"/>
               </w:rPr>
             </w:pPr>
-            <w:hyperlink r:id="rId36">
+            <w:hyperlink r:id="rId42">
               <w:r>
                 <w:rPr>
                   <w:rFonts w:ascii="Arial" w:hAnsi="Arial" w:cs="Arial"/>
@@ -12549,7 +12484,7 @@
                 <w:szCs w:val="24"/>
               </w:rPr>
             </w:pPr>
-            <w:hyperlink r:id="rId37">
+            <w:hyperlink r:id="rId43">
               <w:r>
                 <w:rPr>
                   <w:rFonts w:ascii="Arial" w:hAnsi="Arial" w:cs="Arial"/>
@@ -12666,7 +12601,7 @@
                 <w:szCs w:val="24"/>
               </w:rPr>
             </w:pPr>
-            <w:hyperlink r:id="rId38">
+            <w:hyperlink r:id="rId44">
               <w:r>
                 <w:rPr>
                   <w:rFonts w:ascii="Arial" w:hAnsi="Arial" w:cs="Arial"/>
@@ -12783,7 +12718,7 @@
                 <w:szCs w:val="24"/>
               </w:rPr>
             </w:pPr>
-            <w:hyperlink r:id="rId39">
+            <w:hyperlink r:id="rId45">
               <w:r>
                 <w:rPr>
                   <w:rFonts w:ascii="Arial" w:hAnsi="Arial" w:cs="Arial"/>
@@ -12900,7 +12835,7 @@
                 <w:szCs w:val="24"/>
               </w:rPr>
             </w:pPr>
-            <w:hyperlink r:id="rId40">
+            <w:hyperlink r:id="rId46">
               <w:r>
                 <w:rPr>
                   <w:rFonts w:ascii="Arial" w:hAnsi="Arial" w:cs="Arial"/>
@@ -13073,7 +13008,7 @@
                 <w:szCs w:val="24"/>
               </w:rPr>
             </w:pPr>
-            <w:hyperlink r:id="rId41">
+            <w:hyperlink r:id="rId47">
               <w:r>
                 <w:rPr>
                   <w:rFonts w:ascii="Arial" w:hAnsi="Arial" w:cs="Arial"/>
@@ -13108,7 +13043,7 @@
     </w:p>
     <w:p>
       <w:pPr>
-        <w:pStyle w:val="Heading1"/>
+        <w:pStyle w:val="Kop1"/>
         <w:spacing w:before="0"/>
         <w:rPr>
           <w:rFonts w:ascii="Arial" w:hAnsi="Arial" w:cs="Arial"/>
@@ -13279,7 +13214,7 @@
     </w:p>
     <w:p>
       <w:pPr>
-        <w:pStyle w:val="Heading1"/>
+        <w:pStyle w:val="Kop1"/>
         <w:spacing w:before="0"/>
         <w:rPr>
           <w:rFonts w:ascii="Arial" w:hAnsi="Arial" w:cs="Arial"/>
@@ -13320,7 +13255,7 @@
     </w:p>
     <w:tbl>
       <w:tblPr>
-        <w:tblStyle w:val="TableGrid"/>
+        <w:tblStyle w:val="Tabelraster"/>
         <w:tblW w:w="9592" w:type="dxa"/>
         <w:jc w:val="center"/>
         <w:tblLayout w:type="fixed"/>
@@ -13769,7 +13704,7 @@
     </w:p>
     <w:p>
       <w:pPr>
-        <w:pStyle w:val="Heading1"/>
+        <w:pStyle w:val="Kop1"/>
         <w:spacing w:before="0"/>
         <w:rPr>
           <w:rFonts w:ascii="Arial" w:hAnsi="Arial" w:cs="Arial"/>
@@ -13825,7 +13760,7 @@
                     </pic:cNvPicPr>
                   </pic:nvPicPr>
                   <pic:blipFill>
-                    <a:blip r:embed="rId42"/>
+                    <a:blip r:embed="rId48"/>
                     <a:stretch>
                       <a:fillRect/>
                     </a:stretch>
@@ -13885,7 +13820,7 @@
     </w:p>
     <w:p>
       <w:pPr>
-        <w:pStyle w:val="Heading2"/>
+        <w:pStyle w:val="Kop2"/>
         <w:rPr>
           <w:rFonts w:ascii="Arial" w:hAnsi="Arial"/>
           <w:sz w:val="28"/>
@@ -13995,7 +13930,7 @@
     </w:p>
     <w:p>
       <w:pPr>
-        <w:pStyle w:val="Heading2"/>
+        <w:pStyle w:val="Kop2"/>
         <w:rPr>
           <w:rFonts w:ascii="Arial" w:hAnsi="Arial"/>
           <w:sz w:val="28"/>
@@ -14201,7 +14136,7 @@
     </w:p>
     <w:p>
       <w:pPr>
-        <w:pStyle w:val="Heading2"/>
+        <w:pStyle w:val="Kop2"/>
         <w:rPr>
           <w:rFonts w:ascii="Arial" w:hAnsi="Arial"/>
           <w:sz w:val="28"/>
@@ -14441,7 +14376,7 @@
     </w:p>
     <w:p>
       <w:pPr>
-        <w:pStyle w:val="Heading1"/>
+        <w:pStyle w:val="Kop1"/>
         <w:spacing w:before="0"/>
         <w:rPr>
           <w:rFonts w:ascii="Arial" w:hAnsi="Arial" w:cs="Arial"/>
@@ -14549,7 +14484,7 @@
     </w:p>
     <w:p>
       <w:pPr>
-        <w:pStyle w:val="Heading1"/>
+        <w:pStyle w:val="Kop1"/>
         <w:spacing w:before="0"/>
         <w:rPr>
           <w:rFonts w:ascii="Arial" w:hAnsi="Arial" w:cs="Arial"/>
@@ -14587,7 +14522,7 @@
         </w:rPr>
         <w:t xml:space="preserve">• Arduino. (z.d.). Arduino Documentation. Geraadpleegd via </w:t>
       </w:r>
-      <w:hyperlink r:id="rId43">
+      <w:hyperlink r:id="rId49">
         <w:r>
           <w:rPr>
             <w:rStyle w:val="Hyperlink"/>
@@ -14615,7 +14550,7 @@
         </w:rPr>
         <w:t xml:space="preserve">• Tinkercad. (z.d.). Circuits. Geraadpleegd via </w:t>
       </w:r>
-      <w:hyperlink r:id="rId44">
+      <w:hyperlink r:id="rId50">
         <w:r>
           <w:rPr>
             <w:rStyle w:val="Hyperlink"/>
@@ -14643,7 +14578,7 @@
         </w:rPr>
         <w:t xml:space="preserve">• GitHub-repository van dit project: </w:t>
       </w:r>
-      <w:hyperlink r:id="rId45">
+      <w:hyperlink r:id="rId51">
         <w:r>
           <w:rPr>
             <w:rStyle w:val="Hyperlink"/>
@@ -14719,7 +14654,7 @@
         </w:rPr>
         <w:t xml:space="preserve"> mei 2026, van </w:t>
       </w:r>
-      <w:hyperlink r:id="rId46">
+      <w:hyperlink r:id="rId52">
         <w:r>
           <w:rPr>
             <w:rStyle w:val="Hyperlink"/>
@@ -14782,7 +14717,7 @@
         </w:rPr>
         <w:t xml:space="preserve">• Google Drive-map met dezelfde demo-video’s als extra bewijs en back-up voor als een YouTube-link niet goed werkt: </w:t>
       </w:r>
-      <w:hyperlink r:id="rId47">
+      <w:hyperlink r:id="rId53">
         <w:r>
           <w:rPr>
             <w:rStyle w:val="Hyperlink"/>
@@ -14804,7 +14739,7 @@
     </w:p>
     <w:p>
       <w:pPr>
-        <w:pStyle w:val="Heading1"/>
+        <w:pStyle w:val="Kop1"/>
         <w:spacing w:before="0"/>
         <w:rPr>
           <w:rFonts w:ascii="Arial" w:hAnsi="Arial" w:cs="Arial"/>
@@ -15240,12 +15175,12 @@
       </w:r>
     </w:p>
     <w:sectPr>
-      <w:headerReference w:type="even" r:id="rId48"/>
-      <w:headerReference w:type="default" r:id="rId49"/>
-      <w:footerReference w:type="even" r:id="rId50"/>
-      <w:footerReference w:type="default" r:id="rId51"/>
-      <w:headerReference w:type="first" r:id="rId52"/>
-      <w:footerReference w:type="first" r:id="rId53"/>
+      <w:headerReference w:type="even" r:id="rId54"/>
+      <w:headerReference w:type="default" r:id="rId55"/>
+      <w:footerReference w:type="even" r:id="rId56"/>
+      <w:footerReference w:type="default" r:id="rId57"/>
+      <w:headerReference w:type="first" r:id="rId58"/>
+      <w:footerReference w:type="first" r:id="rId59"/>
       <w:pgSz w:w="11906" w:h="16838"/>
       <w:pgMar w:top="864" w:right="1152" w:bottom="864" w:left="1152" w:header="709" w:footer="709" w:gutter="0"/>
       <w:cols w:space="720"/>
@@ -15286,7 +15221,7 @@
 <w:ftr xmlns:wpc="http://schemas.microsoft.com/office/word/2010/wordprocessingCanvas" xmlns:cx="http://schemas.microsoft.com/office/drawing/2014/chartex" xmlns:cx1="http://schemas.microsoft.com/office/drawing/2015/9/8/chartex" xmlns:cx2="http://schemas.microsoft.com/office/drawing/2015/10/21/chartex" xmlns:cx3="http://schemas.microsoft.com/office/drawing/2016/5/9/chartex" xmlns:cx4="http://schemas.microsoft.com/office/drawing/2016/5/10/chartex" xmlns:cx5="http://schemas.microsoft.com/office/drawing/2016/5/11/chartex" xmlns:cx6="http://schemas.microsoft.com/office/drawing/2016/5/12/chartex" xmlns:cx7="http://schemas.microsoft.com/office/drawing/2016/5/13/chartex" xmlns:cx8="http://schemas.microsoft.com/office/drawing/2016/5/14/chartex" xmlns:mc="http://schemas.openxmlformats.org/markup-compatibility/2006" xmlns:aink="http://schemas.microsoft.com/office/drawing/2016/ink" xmlns:am3d="http://schemas.microsoft.com/office/drawing/2017/model3d" xmlns:o="urn:schemas-microsoft-com:office:office" xmlns:oel="http://schemas.microsoft.com/office/2019/extlst" xmlns:r="http://schemas.openxmlformats.org/officeDocument/2006/relationships" xmlns:m="http://schemas.openxmlformats.org/officeDocument/2006/math" xmlns:v="urn:schemas-microsoft-com:vml" xmlns:wp14="http://schemas.microsoft.com/office/word/2010/wordprocessingDrawing" xmlns:wp="http://schemas.openxmlformats.org/drawingml/2006/wordprocessingDrawing" xmlns:w10="urn:schemas-microsoft-com:office:word" xmlns:w="http://schemas.openxmlformats.org/wordprocessingml/2006/main" xmlns:w14="http://schemas.microsoft.com/office/word/2010/wordml" xmlns:w15="http://schemas.microsoft.com/office/word/2012/wordml" xmlns:w16cex="http://schemas.microsoft.com/office/word/2018/wordml/cex" xmlns:w16cid="http://schemas.microsoft.com/office/word/2016/wordml/cid" xmlns:w16="http://schemas.microsoft.com/office/word/2018/wordml" xmlns:w16du="http://schemas.microsoft.com/office/word/2023/wordml/word16du" xmlns:w16sdtdh="http://schemas.microsoft.com/office/word/2020/wordml/sdtdatahash" xmlns:w16sdtfl="http://schemas.microsoft.com/office/word/2024/wordml/sdtformatlock" xmlns:w16se="http://schemas.microsoft.com/office/word/2015/wordml/symex" xmlns:wpg="http://schemas.microsoft.com/office/word/2010/wordprocessingGroup" xmlns:wpi="http://schemas.microsoft.com/office/word/2010/wordprocessingInk" xmlns:wne="http://schemas.microsoft.com/office/word/2006/wordml" xmlns:wps="http://schemas.microsoft.com/office/word/2010/wordprocessingShape" mc:Ignorable="w14 w15 w16se w16cid w16 w16cex w16sdtdh w16sdtfl w16du wp14">
   <w:p>
     <w:pPr>
-      <w:pStyle w:val="Footer"/>
+      <w:pStyle w:val="Voettekst"/>
     </w:pPr>
   </w:p>
 </w:ftr>
@@ -15296,7 +15231,7 @@
 <w:ftr xmlns:wpc="http://schemas.microsoft.com/office/word/2010/wordprocessingCanvas" xmlns:cx="http://schemas.microsoft.com/office/drawing/2014/chartex" xmlns:cx1="http://schemas.microsoft.com/office/drawing/2015/9/8/chartex" xmlns:cx2="http://schemas.microsoft.com/office/drawing/2015/10/21/chartex" xmlns:cx3="http://schemas.microsoft.com/office/drawing/2016/5/9/chartex" xmlns:cx4="http://schemas.microsoft.com/office/drawing/2016/5/10/chartex" xmlns:cx5="http://schemas.microsoft.com/office/drawing/2016/5/11/chartex" xmlns:cx6="http://schemas.microsoft.com/office/drawing/2016/5/12/chartex" xmlns:cx7="http://schemas.microsoft.com/office/drawing/2016/5/13/chartex" xmlns:cx8="http://schemas.microsoft.com/office/drawing/2016/5/14/chartex" xmlns:mc="http://schemas.openxmlformats.org/markup-compatibility/2006" xmlns:aink="http://schemas.microsoft.com/office/drawing/2016/ink" xmlns:am3d="http://schemas.microsoft.com/office/drawing/2017/model3d" xmlns:o="urn:schemas-microsoft-com:office:office" xmlns:oel="http://schemas.microsoft.com/office/2019/extlst" xmlns:r="http://schemas.openxmlformats.org/officeDocument/2006/relationships" xmlns:m="http://schemas.openxmlformats.org/officeDocument/2006/math" xmlns:v="urn:schemas-microsoft-com:vml" xmlns:wp14="http://schemas.microsoft.com/office/word/2010/wordprocessingDrawing" xmlns:wp="http://schemas.openxmlformats.org/drawingml/2006/wordprocessingDrawing" xmlns:w10="urn:schemas-microsoft-com:office:word" xmlns:w="http://schemas.openxmlformats.org/wordprocessingml/2006/main" xmlns:w14="http://schemas.microsoft.com/office/word/2010/wordml" xmlns:w15="http://schemas.microsoft.com/office/word/2012/wordml" xmlns:w16cex="http://schemas.microsoft.com/office/word/2018/wordml/cex" xmlns:w16cid="http://schemas.microsoft.com/office/word/2016/wordml/cid" xmlns:w16="http://schemas.microsoft.com/office/word/2018/wordml" xmlns:w16du="http://schemas.microsoft.com/office/word/2023/wordml/word16du" xmlns:w16sdtdh="http://schemas.microsoft.com/office/word/2020/wordml/sdtdatahash" xmlns:w16sdtfl="http://schemas.microsoft.com/office/word/2024/wordml/sdtformatlock" xmlns:w16se="http://schemas.microsoft.com/office/word/2015/wordml/symex" xmlns:wpg="http://schemas.microsoft.com/office/word/2010/wordprocessingGroup" xmlns:wpi="http://schemas.microsoft.com/office/word/2010/wordprocessingInk" xmlns:wne="http://schemas.microsoft.com/office/word/2006/wordml" xmlns:wps="http://schemas.microsoft.com/office/word/2010/wordprocessingShape" mc:Ignorable="w14 w15 w16se w16cid w16 w16cex w16sdtdh w16sdtfl w16du wp14">
   <w:p>
     <w:pPr>
-      <w:pStyle w:val="Footer"/>
+      <w:pStyle w:val="Voettekst"/>
       <w:jc w:val="right"/>
       <w:rPr>
         <w:rFonts w:eastAsiaTheme="minorEastAsia" w:cs="Times New Roman"/>
@@ -15305,16 +15240,13 @@
   </w:p>
   <w:p>
     <w:pPr>
-      <w:pStyle w:val="Footer"/>
+      <w:pStyle w:val="Voettekst"/>
       <w:pBdr>
         <w:top w:val="single" w:sz="4" w:space="1" w:color="000000"/>
       </w:pBdr>
     </w:pPr>
     <w:r>
-      <w:t xml:space="preserve">AdA </w:t>
-    </w:r>
-    <w:r>
-      <w:t>Informatica | Stefan Stojkovic</w:t>
+      <w:t>AdA Informatica | Stefan Stojkovic</w:t>
     </w:r>
   </w:p>
 </w:ftr>
@@ -15324,7 +15256,7 @@
 <w:ftr xmlns:wpc="http://schemas.microsoft.com/office/word/2010/wordprocessingCanvas" xmlns:cx="http://schemas.microsoft.com/office/drawing/2014/chartex" xmlns:cx1="http://schemas.microsoft.com/office/drawing/2015/9/8/chartex" xmlns:cx2="http://schemas.microsoft.com/office/drawing/2015/10/21/chartex" xmlns:cx3="http://schemas.microsoft.com/office/drawing/2016/5/9/chartex" xmlns:cx4="http://schemas.microsoft.com/office/drawing/2016/5/10/chartex" xmlns:cx5="http://schemas.microsoft.com/office/drawing/2016/5/11/chartex" xmlns:cx6="http://schemas.microsoft.com/office/drawing/2016/5/12/chartex" xmlns:cx7="http://schemas.microsoft.com/office/drawing/2016/5/13/chartex" xmlns:cx8="http://schemas.microsoft.com/office/drawing/2016/5/14/chartex" xmlns:mc="http://schemas.openxmlformats.org/markup-compatibility/2006" xmlns:aink="http://schemas.microsoft.com/office/drawing/2016/ink" xmlns:am3d="http://schemas.microsoft.com/office/drawing/2017/model3d" xmlns:o="urn:schemas-microsoft-com:office:office" xmlns:oel="http://schemas.microsoft.com/office/2019/extlst" xmlns:r="http://schemas.openxmlformats.org/officeDocument/2006/relationships" xmlns:m="http://schemas.openxmlformats.org/officeDocument/2006/math" xmlns:v="urn:schemas-microsoft-com:vml" xmlns:wp14="http://schemas.microsoft.com/office/word/2010/wordprocessingDrawing" xmlns:wp="http://schemas.openxmlformats.org/drawingml/2006/wordprocessingDrawing" xmlns:w10="urn:schemas-microsoft-com:office:word" xmlns:w="http://schemas.openxmlformats.org/wordprocessingml/2006/main" xmlns:w14="http://schemas.microsoft.com/office/word/2010/wordml" xmlns:w15="http://schemas.microsoft.com/office/word/2012/wordml" xmlns:w16cex="http://schemas.microsoft.com/office/word/2018/wordml/cex" xmlns:w16cid="http://schemas.microsoft.com/office/word/2016/wordml/cid" xmlns:w16="http://schemas.microsoft.com/office/word/2018/wordml" xmlns:w16du="http://schemas.microsoft.com/office/word/2023/wordml/word16du" xmlns:w16sdtdh="http://schemas.microsoft.com/office/word/2020/wordml/sdtdatahash" xmlns:w16sdtfl="http://schemas.microsoft.com/office/word/2024/wordml/sdtformatlock" xmlns:w16se="http://schemas.microsoft.com/office/word/2015/wordml/symex" xmlns:wpg="http://schemas.microsoft.com/office/word/2010/wordprocessingGroup" xmlns:wpi="http://schemas.microsoft.com/office/word/2010/wordprocessingInk" xmlns:wne="http://schemas.microsoft.com/office/word/2006/wordml" xmlns:wps="http://schemas.microsoft.com/office/word/2010/wordprocessingShape" mc:Ignorable="w14 w15 w16se w16cid w16 w16cex w16sdtdh w16sdtfl w16du wp14">
   <w:p>
     <w:pPr>
-      <w:pStyle w:val="Footer"/>
+      <w:pStyle w:val="Voettekst"/>
     </w:pPr>
   </w:p>
 </w:ftr>
@@ -15359,7 +15291,7 @@
 <w:hdr xmlns:wpc="http://schemas.microsoft.com/office/word/2010/wordprocessingCanvas" xmlns:cx="http://schemas.microsoft.com/office/drawing/2014/chartex" xmlns:cx1="http://schemas.microsoft.com/office/drawing/2015/9/8/chartex" xmlns:cx2="http://schemas.microsoft.com/office/drawing/2015/10/21/chartex" xmlns:cx3="http://schemas.microsoft.com/office/drawing/2016/5/9/chartex" xmlns:cx4="http://schemas.microsoft.com/office/drawing/2016/5/10/chartex" xmlns:cx5="http://schemas.microsoft.com/office/drawing/2016/5/11/chartex" xmlns:cx6="http://schemas.microsoft.com/office/drawing/2016/5/12/chartex" xmlns:cx7="http://schemas.microsoft.com/office/drawing/2016/5/13/chartex" xmlns:cx8="http://schemas.microsoft.com/office/drawing/2016/5/14/chartex" xmlns:mc="http://schemas.openxmlformats.org/markup-compatibility/2006" xmlns:aink="http://schemas.microsoft.com/office/drawing/2016/ink" xmlns:am3d="http://schemas.microsoft.com/office/drawing/2017/model3d" xmlns:o="urn:schemas-microsoft-com:office:office" xmlns:oel="http://schemas.microsoft.com/office/2019/extlst" xmlns:r="http://schemas.openxmlformats.org/officeDocument/2006/relationships" xmlns:m="http://schemas.openxmlformats.org/officeDocument/2006/math" xmlns:v="urn:schemas-microsoft-com:vml" xmlns:wp14="http://schemas.microsoft.com/office/word/2010/wordprocessingDrawing" xmlns:wp="http://schemas.openxmlformats.org/drawingml/2006/wordprocessingDrawing" xmlns:w10="urn:schemas-microsoft-com:office:word" xmlns:w="http://schemas.openxmlformats.org/wordprocessingml/2006/main" xmlns:w14="http://schemas.microsoft.com/office/word/2010/wordml" xmlns:w15="http://schemas.microsoft.com/office/word/2012/wordml" xmlns:w16cex="http://schemas.microsoft.com/office/word/2018/wordml/cex" xmlns:w16cid="http://schemas.microsoft.com/office/word/2016/wordml/cid" xmlns:w16="http://schemas.microsoft.com/office/word/2018/wordml" xmlns:w16du="http://schemas.microsoft.com/office/word/2023/wordml/word16du" xmlns:w16sdtdh="http://schemas.microsoft.com/office/word/2020/wordml/sdtdatahash" xmlns:w16sdtfl="http://schemas.microsoft.com/office/word/2024/wordml/sdtformatlock" xmlns:w16se="http://schemas.microsoft.com/office/word/2015/wordml/symex" xmlns:wpg="http://schemas.microsoft.com/office/word/2010/wordprocessingGroup" xmlns:wpi="http://schemas.microsoft.com/office/word/2010/wordprocessingInk" xmlns:wne="http://schemas.microsoft.com/office/word/2006/wordml" xmlns:wps="http://schemas.microsoft.com/office/word/2010/wordprocessingShape" mc:Ignorable="w14 w15 w16se w16cid w16 w16cex w16sdtdh w16sdtfl w16du wp14">
   <w:p>
     <w:pPr>
-      <w:pStyle w:val="Header"/>
+      <w:pStyle w:val="Koptekst"/>
     </w:pPr>
   </w:p>
 </w:hdr>
@@ -15369,7 +15301,7 @@
 <w:hdr xmlns:wpc="http://schemas.microsoft.com/office/word/2010/wordprocessingCanvas" xmlns:cx="http://schemas.microsoft.com/office/drawing/2014/chartex" xmlns:cx1="http://schemas.microsoft.com/office/drawing/2015/9/8/chartex" xmlns:cx2="http://schemas.microsoft.com/office/drawing/2015/10/21/chartex" xmlns:cx3="http://schemas.microsoft.com/office/drawing/2016/5/9/chartex" xmlns:cx4="http://schemas.microsoft.com/office/drawing/2016/5/10/chartex" xmlns:cx5="http://schemas.microsoft.com/office/drawing/2016/5/11/chartex" xmlns:cx6="http://schemas.microsoft.com/office/drawing/2016/5/12/chartex" xmlns:cx7="http://schemas.microsoft.com/office/drawing/2016/5/13/chartex" xmlns:cx8="http://schemas.microsoft.com/office/drawing/2016/5/14/chartex" xmlns:mc="http://schemas.openxmlformats.org/markup-compatibility/2006" xmlns:aink="http://schemas.microsoft.com/office/drawing/2016/ink" xmlns:am3d="http://schemas.microsoft.com/office/drawing/2017/model3d" xmlns:o="urn:schemas-microsoft-com:office:office" xmlns:oel="http://schemas.microsoft.com/office/2019/extlst" xmlns:r="http://schemas.openxmlformats.org/officeDocument/2006/relationships" xmlns:m="http://schemas.openxmlformats.org/officeDocument/2006/math" xmlns:v="urn:schemas-microsoft-com:vml" xmlns:wp14="http://schemas.microsoft.com/office/word/2010/wordprocessingDrawing" xmlns:wp="http://schemas.openxmlformats.org/drawingml/2006/wordprocessingDrawing" xmlns:w10="urn:schemas-microsoft-com:office:word" xmlns:w="http://schemas.openxmlformats.org/wordprocessingml/2006/main" xmlns:w14="http://schemas.microsoft.com/office/word/2010/wordml" xmlns:w15="http://schemas.microsoft.com/office/word/2012/wordml" xmlns:w16cex="http://schemas.microsoft.com/office/word/2018/wordml/cex" xmlns:w16cid="http://schemas.microsoft.com/office/word/2016/wordml/cid" xmlns:w16="http://schemas.microsoft.com/office/word/2018/wordml" xmlns:w16du="http://schemas.microsoft.com/office/word/2023/wordml/word16du" xmlns:w16sdtdh="http://schemas.microsoft.com/office/word/2020/wordml/sdtdatahash" xmlns:w16sdtfl="http://schemas.microsoft.com/office/word/2024/wordml/sdtformatlock" xmlns:w16se="http://schemas.microsoft.com/office/word/2015/wordml/symex" xmlns:wpg="http://schemas.microsoft.com/office/word/2010/wordprocessingGroup" xmlns:wpi="http://schemas.microsoft.com/office/word/2010/wordprocessingInk" xmlns:wne="http://schemas.microsoft.com/office/word/2006/wordml" xmlns:wps="http://schemas.microsoft.com/office/word/2010/wordprocessingShape" mc:Ignorable="w14 w15 w16se w16cid w16 w16cex w16sdtdh w16sdtfl w16du wp14">
   <w:p>
     <w:pPr>
-      <w:pStyle w:val="Header"/>
+      <w:pStyle w:val="Koptekst"/>
       <w:pBdr>
         <w:bottom w:val="single" w:sz="4" w:space="1" w:color="000000"/>
       </w:pBdr>
@@ -15434,7 +15366,7 @@
   </w:p>
   <w:p>
     <w:pPr>
-      <w:pStyle w:val="Header"/>
+      <w:pStyle w:val="Koptekst"/>
       <w:pBdr>
         <w:bottom w:val="single" w:sz="4" w:space="1" w:color="000000"/>
       </w:pBdr>
@@ -15448,7 +15380,7 @@
   </w:p>
   <w:p>
     <w:pPr>
-      <w:pStyle w:val="Header"/>
+      <w:pStyle w:val="Koptekst"/>
       <w:pBdr>
         <w:bottom w:val="single" w:sz="4" w:space="1" w:color="000000"/>
       </w:pBdr>
@@ -15459,7 +15391,7 @@
   </w:p>
   <w:p>
     <w:pPr>
-      <w:pStyle w:val="Header"/>
+      <w:pStyle w:val="Koptekst"/>
       <w:rPr>
         <w:lang w:val="en-US"/>
       </w:rPr>
@@ -15472,7 +15404,7 @@
 <w:hdr xmlns:wpc="http://schemas.microsoft.com/office/word/2010/wordprocessingCanvas" xmlns:cx="http://schemas.microsoft.com/office/drawing/2014/chartex" xmlns:cx1="http://schemas.microsoft.com/office/drawing/2015/9/8/chartex" xmlns:cx2="http://schemas.microsoft.com/office/drawing/2015/10/21/chartex" xmlns:cx3="http://schemas.microsoft.com/office/drawing/2016/5/9/chartex" xmlns:cx4="http://schemas.microsoft.com/office/drawing/2016/5/10/chartex" xmlns:cx5="http://schemas.microsoft.com/office/drawing/2016/5/11/chartex" xmlns:cx6="http://schemas.microsoft.com/office/drawing/2016/5/12/chartex" xmlns:cx7="http://schemas.microsoft.com/office/drawing/2016/5/13/chartex" xmlns:cx8="http://schemas.microsoft.com/office/drawing/2016/5/14/chartex" xmlns:mc="http://schemas.openxmlformats.org/markup-compatibility/2006" xmlns:aink="http://schemas.microsoft.com/office/drawing/2016/ink" xmlns:am3d="http://schemas.microsoft.com/office/drawing/2017/model3d" xmlns:o="urn:schemas-microsoft-com:office:office" xmlns:oel="http://schemas.microsoft.com/office/2019/extlst" xmlns:r="http://schemas.openxmlformats.org/officeDocument/2006/relationships" xmlns:m="http://schemas.openxmlformats.org/officeDocument/2006/math" xmlns:v="urn:schemas-microsoft-com:vml" xmlns:wp14="http://schemas.microsoft.com/office/word/2010/wordprocessingDrawing" xmlns:wp="http://schemas.openxmlformats.org/drawingml/2006/wordprocessingDrawing" xmlns:w10="urn:schemas-microsoft-com:office:word" xmlns:w="http://schemas.openxmlformats.org/wordprocessingml/2006/main" xmlns:w14="http://schemas.microsoft.com/office/word/2010/wordml" xmlns:w15="http://schemas.microsoft.com/office/word/2012/wordml" xmlns:w16cex="http://schemas.microsoft.com/office/word/2018/wordml/cex" xmlns:w16cid="http://schemas.microsoft.com/office/word/2016/wordml/cid" xmlns:w16="http://schemas.microsoft.com/office/word/2018/wordml" xmlns:w16du="http://schemas.microsoft.com/office/word/2023/wordml/word16du" xmlns:w16sdtdh="http://schemas.microsoft.com/office/word/2020/wordml/sdtdatahash" xmlns:w16sdtfl="http://schemas.microsoft.com/office/word/2024/wordml/sdtformatlock" xmlns:w16se="http://schemas.microsoft.com/office/word/2015/wordml/symex" xmlns:wpg="http://schemas.microsoft.com/office/word/2010/wordprocessingGroup" xmlns:wpi="http://schemas.microsoft.com/office/word/2010/wordprocessingInk" xmlns:wne="http://schemas.microsoft.com/office/word/2006/wordml" xmlns:wps="http://schemas.microsoft.com/office/word/2010/wordprocessingShape" mc:Ignorable="w14 w15 w16se w16cid w16 w16cex w16sdtdh w16sdtfl w16du wp14">
   <w:p>
     <w:pPr>
-      <w:pStyle w:val="Header"/>
+      <w:pStyle w:val="Koptekst"/>
     </w:pPr>
   </w:p>
 </w:hdr>
@@ -15487,7 +15419,7 @@
     <w:lvl w:ilvl="0">
       <w:start w:val="1"/>
       <w:numFmt w:val="bullet"/>
-      <w:pStyle w:val="ListParagraph"/>
+      <w:pStyle w:val="Lijstalinea"/>
       <w:lvlText w:val=""/>
       <w:lvlJc w:val="left"/>
       <w:pPr>
@@ -15664,7 +15596,7 @@
     <w:lvl w:ilvl="3">
       <w:start w:val="1"/>
       <w:numFmt w:val="decimal"/>
-      <w:pStyle w:val="Heading4"/>
+      <w:pStyle w:val="Kop4"/>
       <w:lvlText w:val="%1.%2.%3.%4"/>
       <w:lvlJc w:val="left"/>
       <w:pPr>
@@ -15677,7 +15609,7 @@
     <w:lvl w:ilvl="4">
       <w:start w:val="1"/>
       <w:numFmt w:val="decimal"/>
-      <w:pStyle w:val="Heading5"/>
+      <w:pStyle w:val="Kop5"/>
       <w:lvlText w:val="%1.%2.%3.%4.%5"/>
       <w:lvlJc w:val="left"/>
       <w:pPr>
@@ -15690,7 +15622,7 @@
     <w:lvl w:ilvl="5">
       <w:start w:val="1"/>
       <w:numFmt w:val="decimal"/>
-      <w:pStyle w:val="Heading6"/>
+      <w:pStyle w:val="Kop6"/>
       <w:lvlText w:val="%1.%2.%3.%4.%5.%6"/>
       <w:lvlJc w:val="left"/>
       <w:pPr>
@@ -15703,7 +15635,7 @@
     <w:lvl w:ilvl="6">
       <w:start w:val="1"/>
       <w:numFmt w:val="decimal"/>
-      <w:pStyle w:val="Heading7"/>
+      <w:pStyle w:val="Kop7"/>
       <w:lvlText w:val="%1.%2.%3.%4.%5.%6.%7"/>
       <w:lvlJc w:val="left"/>
       <w:pPr>
@@ -15716,7 +15648,7 @@
     <w:lvl w:ilvl="7">
       <w:start w:val="1"/>
       <w:numFmt w:val="decimal"/>
-      <w:pStyle w:val="Heading8"/>
+      <w:pStyle w:val="Kop8"/>
       <w:lvlText w:val="%1.%2.%3.%4.%5.%6.%7.%8"/>
       <w:lvlJc w:val="left"/>
       <w:pPr>
@@ -15729,7 +15661,7 @@
     <w:lvl w:ilvl="8">
       <w:start w:val="1"/>
       <w:numFmt w:val="decimal"/>
-      <w:pStyle w:val="Heading9"/>
+      <w:pStyle w:val="Kop9"/>
       <w:lvlText w:val="%1.%2.%3.%4.%5.%6.%7.%8.%9"/>
       <w:lvlJc w:val="left"/>
       <w:pPr>
@@ -16144,7 +16076,7 @@
     <w:lsdException w:name="Unresolved Mention" w:semiHidden="1" w:unhideWhenUsed="1"/>
     <w:lsdException w:name="Smart Link" w:semiHidden="1" w:unhideWhenUsed="1"/>
   </w:latentStyles>
-  <w:style w:type="paragraph" w:default="1" w:styleId="Normal">
+  <w:style w:type="paragraph" w:default="1" w:styleId="Standaard">
     <w:name w:val="Normal"/>
     <w:qFormat/>
     <w:rsid w:val="00352C72"/>
@@ -16155,11 +16087,11 @@
       <w:sz w:val="21"/>
     </w:rPr>
   </w:style>
-  <w:style w:type="paragraph" w:styleId="Heading1">
+  <w:style w:type="paragraph" w:styleId="Kop1">
     <w:name w:val="heading 1"/>
-    <w:basedOn w:val="Normal"/>
-    <w:next w:val="Normal"/>
-    <w:link w:val="Heading1Char"/>
+    <w:basedOn w:val="Standaard"/>
+    <w:next w:val="Standaard"/>
+    <w:link w:val="Kop1Char"/>
     <w:autoRedefine/>
     <w:uiPriority w:val="9"/>
     <w:qFormat/>
@@ -16182,11 +16114,11 @@
       <w:vertAlign w:val="superscript"/>
     </w:rPr>
   </w:style>
-  <w:style w:type="paragraph" w:styleId="Heading2">
+  <w:style w:type="paragraph" w:styleId="Kop2">
     <w:name w:val="heading 2"/>
-    <w:basedOn w:val="Heading1"/>
-    <w:next w:val="Normal"/>
-    <w:link w:val="Heading2Char"/>
+    <w:basedOn w:val="Kop1"/>
+    <w:next w:val="Standaard"/>
+    <w:link w:val="Kop2Char"/>
     <w:autoRedefine/>
     <w:uiPriority w:val="9"/>
     <w:qFormat/>
@@ -16202,11 +16134,11 @@
       <w:lang w:eastAsia="nl-NL"/>
     </w:rPr>
   </w:style>
-  <w:style w:type="paragraph" w:styleId="Heading3">
+  <w:style w:type="paragraph" w:styleId="Kop3">
     <w:name w:val="heading 3"/>
-    <w:basedOn w:val="Normal"/>
-    <w:next w:val="Normal"/>
-    <w:link w:val="Heading3Char"/>
+    <w:basedOn w:val="Standaard"/>
+    <w:next w:val="Standaard"/>
+    <w:link w:val="Kop3Char"/>
     <w:autoRedefine/>
     <w:uiPriority w:val="9"/>
     <w:unhideWhenUsed/>
@@ -16226,11 +16158,11 @@
       <w:szCs w:val="24"/>
     </w:rPr>
   </w:style>
-  <w:style w:type="paragraph" w:styleId="Heading4">
+  <w:style w:type="paragraph" w:styleId="Kop4">
     <w:name w:val="heading 4"/>
-    <w:basedOn w:val="Normal"/>
-    <w:next w:val="Normal"/>
-    <w:link w:val="Heading4Char"/>
+    <w:basedOn w:val="Standaard"/>
+    <w:next w:val="Standaard"/>
+    <w:link w:val="Kop4Char"/>
     <w:autoRedefine/>
     <w:uiPriority w:val="9"/>
     <w:unhideWhenUsed/>
@@ -16253,11 +16185,11 @@
       <w:color w:val="2F5496" w:themeColor="accent1" w:themeShade="BF"/>
     </w:rPr>
   </w:style>
-  <w:style w:type="paragraph" w:styleId="Heading5">
+  <w:style w:type="paragraph" w:styleId="Kop5">
     <w:name w:val="heading 5"/>
-    <w:basedOn w:val="Normal"/>
-    <w:next w:val="Normal"/>
-    <w:link w:val="Heading5Char"/>
+    <w:basedOn w:val="Standaard"/>
+    <w:next w:val="Standaard"/>
+    <w:link w:val="Kop5Char"/>
     <w:uiPriority w:val="9"/>
     <w:semiHidden/>
     <w:unhideWhenUsed/>
@@ -16278,11 +16210,11 @@
       <w:color w:val="2F5496" w:themeColor="accent1" w:themeShade="BF"/>
     </w:rPr>
   </w:style>
-  <w:style w:type="paragraph" w:styleId="Heading6">
+  <w:style w:type="paragraph" w:styleId="Kop6">
     <w:name w:val="heading 6"/>
-    <w:basedOn w:val="Normal"/>
-    <w:next w:val="Normal"/>
-    <w:link w:val="Heading6Char"/>
+    <w:basedOn w:val="Standaard"/>
+    <w:next w:val="Standaard"/>
+    <w:link w:val="Kop6Char"/>
     <w:uiPriority w:val="9"/>
     <w:semiHidden/>
     <w:unhideWhenUsed/>
@@ -16303,11 +16235,11 @@
       <w:color w:val="1F3763" w:themeColor="accent1" w:themeShade="7F"/>
     </w:rPr>
   </w:style>
-  <w:style w:type="paragraph" w:styleId="Heading7">
+  <w:style w:type="paragraph" w:styleId="Kop7">
     <w:name w:val="heading 7"/>
-    <w:basedOn w:val="Normal"/>
-    <w:next w:val="Normal"/>
-    <w:link w:val="Heading7Char"/>
+    <w:basedOn w:val="Standaard"/>
+    <w:next w:val="Standaard"/>
+    <w:link w:val="Kop7Char"/>
     <w:uiPriority w:val="9"/>
     <w:semiHidden/>
     <w:unhideWhenUsed/>
@@ -16330,11 +16262,11 @@
       <w:color w:val="1F3763" w:themeColor="accent1" w:themeShade="7F"/>
     </w:rPr>
   </w:style>
-  <w:style w:type="paragraph" w:styleId="Heading8">
+  <w:style w:type="paragraph" w:styleId="Kop8">
     <w:name w:val="heading 8"/>
-    <w:basedOn w:val="Normal"/>
-    <w:next w:val="Normal"/>
-    <w:link w:val="Heading8Char"/>
+    <w:basedOn w:val="Standaard"/>
+    <w:next w:val="Standaard"/>
+    <w:link w:val="Kop8Char"/>
     <w:uiPriority w:val="9"/>
     <w:semiHidden/>
     <w:unhideWhenUsed/>
@@ -16356,11 +16288,11 @@
       <w:szCs w:val="21"/>
     </w:rPr>
   </w:style>
-  <w:style w:type="paragraph" w:styleId="Heading9">
+  <w:style w:type="paragraph" w:styleId="Kop9">
     <w:name w:val="heading 9"/>
-    <w:basedOn w:val="Normal"/>
-    <w:next w:val="Normal"/>
-    <w:link w:val="Heading9Char"/>
+    <w:basedOn w:val="Standaard"/>
+    <w:next w:val="Standaard"/>
+    <w:link w:val="Kop9Char"/>
     <w:uiPriority w:val="9"/>
     <w:semiHidden/>
     <w:unhideWhenUsed/>
@@ -16384,12 +16316,13 @@
       <w:szCs w:val="21"/>
     </w:rPr>
   </w:style>
-  <w:style w:type="character" w:default="1" w:styleId="DefaultParagraphFont">
+  <w:style w:type="character" w:default="1" w:styleId="Standaardalinea-lettertype">
     <w:name w:val="Default Paragraph Font"/>
     <w:uiPriority w:val="1"/>
+    <w:semiHidden/>
     <w:unhideWhenUsed/>
   </w:style>
-  <w:style w:type="table" w:default="1" w:styleId="TableNormal">
+  <w:style w:type="table" w:default="1" w:styleId="Standaardtabel">
     <w:name w:val="Normal Table"/>
     <w:uiPriority w:val="99"/>
     <w:semiHidden/>
@@ -16404,15 +16337,15 @@
       </w:tblCellMar>
     </w:tblPr>
   </w:style>
-  <w:style w:type="numbering" w:default="1" w:styleId="NoList">
+  <w:style w:type="numbering" w:default="1" w:styleId="Geenlijst">
     <w:name w:val="No List"/>
     <w:uiPriority w:val="99"/>
     <w:semiHidden/>
     <w:unhideWhenUsed/>
   </w:style>
-  <w:style w:type="character" w:styleId="CommentReference">
+  <w:style w:type="character" w:styleId="Verwijzingopmerking">
     <w:name w:val="annotation reference"/>
-    <w:basedOn w:val="DefaultParagraphFont"/>
+    <w:basedOn w:val="Standaardalinea-lettertype"/>
     <w:uiPriority w:val="99"/>
     <w:semiHidden/>
     <w:unhideWhenUsed/>
@@ -16423,10 +16356,10 @@
       <w:szCs w:val="16"/>
     </w:rPr>
   </w:style>
-  <w:style w:type="character" w:customStyle="1" w:styleId="CommentTextChar">
-    <w:name w:val="Comment Text Char"/>
-    <w:basedOn w:val="DefaultParagraphFont"/>
-    <w:link w:val="CommentText"/>
+  <w:style w:type="character" w:customStyle="1" w:styleId="TekstopmerkingChar">
+    <w:name w:val="Tekst opmerking Char"/>
+    <w:basedOn w:val="Standaardalinea-lettertype"/>
+    <w:link w:val="Tekstopmerking"/>
     <w:uiPriority w:val="99"/>
     <w:semiHidden/>
     <w:qFormat/>
@@ -16436,10 +16369,10 @@
       <w:szCs w:val="20"/>
     </w:rPr>
   </w:style>
-  <w:style w:type="character" w:customStyle="1" w:styleId="CommentSubjectChar">
-    <w:name w:val="Comment Subject Char"/>
-    <w:basedOn w:val="CommentTextChar"/>
-    <w:link w:val="CommentSubject"/>
+  <w:style w:type="character" w:customStyle="1" w:styleId="OnderwerpvanopmerkingChar">
+    <w:name w:val="Onderwerp van opmerking Char"/>
+    <w:basedOn w:val="TekstopmerkingChar"/>
+    <w:link w:val="Onderwerpvanopmerking"/>
     <w:uiPriority w:val="99"/>
     <w:semiHidden/>
     <w:qFormat/>
@@ -16451,10 +16384,10 @@
       <w:szCs w:val="20"/>
     </w:rPr>
   </w:style>
-  <w:style w:type="character" w:customStyle="1" w:styleId="BalloonTextChar">
-    <w:name w:val="Balloon Text Char"/>
-    <w:basedOn w:val="DefaultParagraphFont"/>
-    <w:link w:val="BalloonText"/>
+  <w:style w:type="character" w:customStyle="1" w:styleId="BallontekstChar">
+    <w:name w:val="Ballontekst Char"/>
+    <w:basedOn w:val="Standaardalinea-lettertype"/>
+    <w:link w:val="Ballontekst"/>
     <w:uiPriority w:val="99"/>
     <w:semiHidden/>
     <w:qFormat/>
@@ -16465,9 +16398,9 @@
       <w:szCs w:val="18"/>
     </w:rPr>
   </w:style>
-  <w:style w:type="character" w:styleId="Emphasis">
+  <w:style w:type="character" w:styleId="Nadruk">
     <w:name w:val="Emphasis"/>
-    <w:basedOn w:val="DefaultParagraphFont"/>
+    <w:basedOn w:val="Standaardalinea-lettertype"/>
     <w:uiPriority w:val="20"/>
     <w:qFormat/>
     <w:rsid w:val="0021598C"/>
@@ -16476,10 +16409,10 @@
       <w:iCs/>
     </w:rPr>
   </w:style>
-  <w:style w:type="character" w:customStyle="1" w:styleId="Heading2Char">
-    <w:name w:val="Heading 2 Char"/>
-    <w:basedOn w:val="DefaultParagraphFont"/>
-    <w:link w:val="Heading2"/>
+  <w:style w:type="character" w:customStyle="1" w:styleId="Kop2Char">
+    <w:name w:val="Kop 2 Char"/>
+    <w:basedOn w:val="Standaardalinea-lettertype"/>
+    <w:link w:val="Kop2"/>
     <w:uiPriority w:val="9"/>
     <w:qFormat/>
     <w:rsid w:val="00E45B8D"/>
@@ -16494,7 +16427,7 @@
   </w:style>
   <w:style w:type="character" w:styleId="Hyperlink">
     <w:name w:val="Hyperlink"/>
-    <w:basedOn w:val="DefaultParagraphFont"/>
+    <w:basedOn w:val="Standaardalinea-lettertype"/>
     <w:uiPriority w:val="99"/>
     <w:unhideWhenUsed/>
     <w:rsid w:val="00BE0894"/>
@@ -16503,10 +16436,10 @@
       <w:u w:val="single"/>
     </w:rPr>
   </w:style>
-  <w:style w:type="character" w:customStyle="1" w:styleId="Heading1Char">
-    <w:name w:val="Heading 1 Char"/>
-    <w:basedOn w:val="DefaultParagraphFont"/>
-    <w:link w:val="Heading1"/>
+  <w:style w:type="character" w:customStyle="1" w:styleId="Kop1Char">
+    <w:name w:val="Kop 1 Char"/>
+    <w:basedOn w:val="Standaardalinea-lettertype"/>
+    <w:link w:val="Kop1"/>
     <w:uiPriority w:val="9"/>
     <w:qFormat/>
     <w:rsid w:val="00675FDA"/>
@@ -16519,9 +16452,9 @@
       <w:vertAlign w:val="superscript"/>
     </w:rPr>
   </w:style>
-  <w:style w:type="character" w:styleId="IntenseEmphasis">
+  <w:style w:type="character" w:styleId="Intensievebenadrukking">
     <w:name w:val="Intense Emphasis"/>
-    <w:basedOn w:val="DefaultParagraphFont"/>
+    <w:basedOn w:val="Standaardalinea-lettertype"/>
     <w:uiPriority w:val="21"/>
     <w:qFormat/>
     <w:rsid w:val="00E70D87"/>
@@ -16531,9 +16464,9 @@
       <w:color w:val="4472C4" w:themeColor="accent1"/>
     </w:rPr>
   </w:style>
-  <w:style w:type="character" w:styleId="Strong">
+  <w:style w:type="character" w:styleId="Zwaar">
     <w:name w:val="Strong"/>
-    <w:basedOn w:val="DefaultParagraphFont"/>
+    <w:basedOn w:val="Standaardalinea-lettertype"/>
     <w:uiPriority w:val="22"/>
     <w:qFormat/>
     <w:rsid w:val="00AB7B0D"/>
@@ -16544,32 +16477,32 @@
   </w:style>
   <w:style w:type="character" w:customStyle="1" w:styleId="normaltextrun">
     <w:name w:val="normaltextrun"/>
-    <w:basedOn w:val="DefaultParagraphFont"/>
+    <w:basedOn w:val="Standaardalinea-lettertype"/>
     <w:qFormat/>
     <w:rsid w:val="00285604"/>
   </w:style>
   <w:style w:type="character" w:customStyle="1" w:styleId="eop">
     <w:name w:val="eop"/>
-    <w:basedOn w:val="DefaultParagraphFont"/>
+    <w:basedOn w:val="Standaardalinea-lettertype"/>
     <w:qFormat/>
     <w:rsid w:val="00285604"/>
   </w:style>
   <w:style w:type="character" w:customStyle="1" w:styleId="spellingerror">
     <w:name w:val="spellingerror"/>
-    <w:basedOn w:val="DefaultParagraphFont"/>
+    <w:basedOn w:val="Standaardalinea-lettertype"/>
     <w:qFormat/>
     <w:rsid w:val="00285604"/>
   </w:style>
   <w:style w:type="character" w:customStyle="1" w:styleId="contextualspellingandgrammarerror">
     <w:name w:val="contextualspellingandgrammarerror"/>
-    <w:basedOn w:val="DefaultParagraphFont"/>
+    <w:basedOn w:val="Standaardalinea-lettertype"/>
     <w:qFormat/>
     <w:rsid w:val="00285604"/>
   </w:style>
-  <w:style w:type="character" w:customStyle="1" w:styleId="Heading3Char">
-    <w:name w:val="Heading 3 Char"/>
-    <w:basedOn w:val="DefaultParagraphFont"/>
-    <w:link w:val="Heading3"/>
+  <w:style w:type="character" w:customStyle="1" w:styleId="Kop3Char">
+    <w:name w:val="Kop 3 Char"/>
+    <w:basedOn w:val="Standaardalinea-lettertype"/>
+    <w:link w:val="Kop3"/>
     <w:uiPriority w:val="9"/>
     <w:qFormat/>
     <w:rsid w:val="00230FF1"/>
@@ -16579,9 +16512,9 @@
       <w:szCs w:val="24"/>
     </w:rPr>
   </w:style>
-  <w:style w:type="character" w:customStyle="1" w:styleId="ListParagraphChar">
-    <w:name w:val="List Paragraph Char"/>
-    <w:link w:val="ListParagraph"/>
+  <w:style w:type="character" w:customStyle="1" w:styleId="LijstalineaChar">
+    <w:name w:val="Lijstalinea Char"/>
+    <w:link w:val="Lijstalinea"/>
     <w:uiPriority w:val="34"/>
     <w:qFormat/>
     <w:locked/>
@@ -16591,10 +16524,10 @@
       <w:lang w:eastAsia="nl-NL"/>
     </w:rPr>
   </w:style>
-  <w:style w:type="character" w:customStyle="1" w:styleId="HeaderChar">
-    <w:name w:val="Header Char"/>
-    <w:basedOn w:val="DefaultParagraphFont"/>
-    <w:link w:val="Header"/>
+  <w:style w:type="character" w:customStyle="1" w:styleId="KoptekstChar">
+    <w:name w:val="Koptekst Char"/>
+    <w:basedOn w:val="Standaardalinea-lettertype"/>
+    <w:link w:val="Koptekst"/>
     <w:uiPriority w:val="99"/>
     <w:qFormat/>
     <w:rsid w:val="00581384"/>
@@ -16603,17 +16536,17 @@
       <w:lang w:eastAsia="nl-NL"/>
     </w:rPr>
   </w:style>
-  <w:style w:type="character" w:customStyle="1" w:styleId="FooterChar">
-    <w:name w:val="Footer Char"/>
-    <w:basedOn w:val="DefaultParagraphFont"/>
-    <w:link w:val="Footer"/>
+  <w:style w:type="character" w:customStyle="1" w:styleId="VoettekstChar">
+    <w:name w:val="Voettekst Char"/>
+    <w:basedOn w:val="Standaardalinea-lettertype"/>
+    <w:link w:val="Voettekst"/>
     <w:uiPriority w:val="99"/>
     <w:qFormat/>
     <w:rsid w:val="00017C54"/>
   </w:style>
-  <w:style w:type="character" w:styleId="UnresolvedMention">
+  <w:style w:type="character" w:styleId="Onopgelostemelding">
     <w:name w:val="Unresolved Mention"/>
-    <w:basedOn w:val="DefaultParagraphFont"/>
+    <w:basedOn w:val="Standaardalinea-lettertype"/>
     <w:uiPriority w:val="99"/>
     <w:semiHidden/>
     <w:unhideWhenUsed/>
@@ -16626,7 +16559,7 @@
   </w:style>
   <w:style w:type="character" w:customStyle="1" w:styleId="KopChar">
     <w:name w:val="Kop Char"/>
-    <w:basedOn w:val="Heading2Char"/>
+    <w:basedOn w:val="Kop2Char"/>
     <w:link w:val="Kop"/>
     <w:qFormat/>
     <w:rsid w:val="00BF3E81"/>
@@ -16641,10 +16574,10 @@
       <w:lang w:eastAsia="nl-NL"/>
     </w:rPr>
   </w:style>
-  <w:style w:type="character" w:customStyle="1" w:styleId="Heading4Char">
-    <w:name w:val="Heading 4 Char"/>
-    <w:basedOn w:val="DefaultParagraphFont"/>
-    <w:link w:val="Heading4"/>
+  <w:style w:type="character" w:customStyle="1" w:styleId="Kop4Char">
+    <w:name w:val="Kop 4 Char"/>
+    <w:basedOn w:val="Standaardalinea-lettertype"/>
+    <w:link w:val="Kop4"/>
     <w:uiPriority w:val="9"/>
     <w:qFormat/>
     <w:rsid w:val="00C10444"/>
@@ -16656,10 +16589,10 @@
       <w:sz w:val="20"/>
     </w:rPr>
   </w:style>
-  <w:style w:type="character" w:customStyle="1" w:styleId="Heading5Char">
-    <w:name w:val="Heading 5 Char"/>
-    <w:basedOn w:val="DefaultParagraphFont"/>
-    <w:link w:val="Heading5"/>
+  <w:style w:type="character" w:customStyle="1" w:styleId="Kop5Char">
+    <w:name w:val="Kop 5 Char"/>
+    <w:basedOn w:val="Standaardalinea-lettertype"/>
+    <w:link w:val="Kop5"/>
     <w:uiPriority w:val="9"/>
     <w:semiHidden/>
     <w:qFormat/>
@@ -16670,10 +16603,10 @@
       <w:sz w:val="20"/>
     </w:rPr>
   </w:style>
-  <w:style w:type="character" w:customStyle="1" w:styleId="Heading6Char">
-    <w:name w:val="Heading 6 Char"/>
-    <w:basedOn w:val="DefaultParagraphFont"/>
-    <w:link w:val="Heading6"/>
+  <w:style w:type="character" w:customStyle="1" w:styleId="Kop6Char">
+    <w:name w:val="Kop 6 Char"/>
+    <w:basedOn w:val="Standaardalinea-lettertype"/>
+    <w:link w:val="Kop6"/>
     <w:uiPriority w:val="9"/>
     <w:semiHidden/>
     <w:qFormat/>
@@ -16684,10 +16617,10 @@
       <w:sz w:val="20"/>
     </w:rPr>
   </w:style>
-  <w:style w:type="character" w:customStyle="1" w:styleId="Heading7Char">
-    <w:name w:val="Heading 7 Char"/>
-    <w:basedOn w:val="DefaultParagraphFont"/>
-    <w:link w:val="Heading7"/>
+  <w:style w:type="character" w:customStyle="1" w:styleId="Kop7Char">
+    <w:name w:val="Kop 7 Char"/>
+    <w:basedOn w:val="Standaardalinea-lettertype"/>
+    <w:link w:val="Kop7"/>
     <w:uiPriority w:val="9"/>
     <w:semiHidden/>
     <w:qFormat/>
@@ -16700,10 +16633,10 @@
       <w:sz w:val="20"/>
     </w:rPr>
   </w:style>
-  <w:style w:type="character" w:customStyle="1" w:styleId="Heading8Char">
-    <w:name w:val="Heading 8 Char"/>
-    <w:basedOn w:val="DefaultParagraphFont"/>
-    <w:link w:val="Heading8"/>
+  <w:style w:type="character" w:customStyle="1" w:styleId="Kop8Char">
+    <w:name w:val="Kop 8 Char"/>
+    <w:basedOn w:val="Standaardalinea-lettertype"/>
+    <w:link w:val="Kop8"/>
     <w:uiPriority w:val="9"/>
     <w:semiHidden/>
     <w:qFormat/>
@@ -16715,10 +16648,10 @@
       <w:szCs w:val="21"/>
     </w:rPr>
   </w:style>
-  <w:style w:type="character" w:customStyle="1" w:styleId="Heading9Char">
-    <w:name w:val="Heading 9 Char"/>
-    <w:basedOn w:val="DefaultParagraphFont"/>
-    <w:link w:val="Heading9"/>
+  <w:style w:type="character" w:customStyle="1" w:styleId="Kop9Char">
+    <w:name w:val="Kop 9 Char"/>
+    <w:basedOn w:val="Standaardalinea-lettertype"/>
+    <w:link w:val="Kop9"/>
     <w:uiPriority w:val="9"/>
     <w:semiHidden/>
     <w:qFormat/>
@@ -16732,10 +16665,10 @@
       <w:szCs w:val="21"/>
     </w:rPr>
   </w:style>
-  <w:style w:type="character" w:customStyle="1" w:styleId="FootnoteTextChar">
-    <w:name w:val="Footnote Text Char"/>
-    <w:basedOn w:val="DefaultParagraphFont"/>
-    <w:link w:val="FootnoteText"/>
+  <w:style w:type="character" w:customStyle="1" w:styleId="VoetnoottekstChar">
+    <w:name w:val="Voetnoottekst Char"/>
+    <w:basedOn w:val="Standaardalinea-lettertype"/>
+    <w:link w:val="Voetnoottekst"/>
     <w:uiPriority w:val="99"/>
     <w:semiHidden/>
     <w:qFormat/>
@@ -16748,7 +16681,7 @@
   </w:style>
   <w:style w:type="character" w:customStyle="1" w:styleId="FootnoteCharacters">
     <w:name w:val="Footnote Characters"/>
-    <w:basedOn w:val="DefaultParagraphFont"/>
+    <w:basedOn w:val="Standaardalinea-lettertype"/>
     <w:uiPriority w:val="99"/>
     <w:semiHidden/>
     <w:unhideWhenUsed/>
@@ -16758,15 +16691,15 @@
       <w:vertAlign w:val="superscript"/>
     </w:rPr>
   </w:style>
-  <w:style w:type="character" w:styleId="FootnoteReference">
+  <w:style w:type="character" w:styleId="Voetnootmarkering">
     <w:name w:val="footnote reference"/>
     <w:rPr>
       <w:vertAlign w:val="superscript"/>
     </w:rPr>
   </w:style>
-  <w:style w:type="character" w:styleId="FollowedHyperlink">
+  <w:style w:type="character" w:styleId="GevolgdeHyperlink">
     <w:name w:val="FollowedHyperlink"/>
-    <w:basedOn w:val="DefaultParagraphFont"/>
+    <w:basedOn w:val="Standaardalinea-lettertype"/>
     <w:uiPriority w:val="99"/>
     <w:semiHidden/>
     <w:unhideWhenUsed/>
@@ -16782,8 +16715,8 @@
   </w:style>
   <w:style w:type="paragraph" w:customStyle="1" w:styleId="Heading">
     <w:name w:val="Heading"/>
-    <w:basedOn w:val="Normal"/>
-    <w:next w:val="BodyText"/>
+    <w:basedOn w:val="Standaard"/>
+    <w:next w:val="Plattetekst"/>
     <w:qFormat/>
     <w:pPr>
       <w:keepNext/>
@@ -16795,24 +16728,24 @@
       <w:szCs w:val="28"/>
     </w:rPr>
   </w:style>
-  <w:style w:type="paragraph" w:styleId="BodyText">
+  <w:style w:type="paragraph" w:styleId="Plattetekst">
     <w:name w:val="Body Text"/>
-    <w:basedOn w:val="Normal"/>
+    <w:basedOn w:val="Standaard"/>
     <w:pPr>
       <w:spacing w:after="140" w:line="276" w:lineRule="auto"/>
     </w:pPr>
   </w:style>
-  <w:style w:type="paragraph" w:styleId="List">
+  <w:style w:type="paragraph" w:styleId="Lijst">
     <w:name w:val="List"/>
-    <w:basedOn w:val="BodyText"/>
+    <w:basedOn w:val="Plattetekst"/>
     <w:rPr>
       <w:rFonts w:cs="Lohit Devanagari"/>
     </w:rPr>
   </w:style>
-  <w:style w:type="paragraph" w:styleId="Caption">
+  <w:style w:type="paragraph" w:styleId="Bijschrift">
     <w:name w:val="caption"/>
-    <w:basedOn w:val="Normal"/>
-    <w:next w:val="Normal"/>
+    <w:basedOn w:val="Standaard"/>
+    <w:next w:val="Standaard"/>
     <w:autoRedefine/>
     <w:uiPriority w:val="35"/>
     <w:unhideWhenUsed/>
@@ -16834,7 +16767,7 @@
   </w:style>
   <w:style w:type="paragraph" w:customStyle="1" w:styleId="Index">
     <w:name w:val="Index"/>
-    <w:basedOn w:val="Normal"/>
+    <w:basedOn w:val="Standaard"/>
     <w:qFormat/>
     <w:pPr>
       <w:suppressLineNumbers/>
@@ -16843,10 +16776,10 @@
       <w:rFonts w:cs="Lohit Devanagari"/>
     </w:rPr>
   </w:style>
-  <w:style w:type="paragraph" w:styleId="ListParagraph">
+  <w:style w:type="paragraph" w:styleId="Lijstalinea">
     <w:name w:val="List Paragraph"/>
-    <w:basedOn w:val="Normal"/>
-    <w:link w:val="ListParagraphChar"/>
+    <w:basedOn w:val="Standaard"/>
+    <w:link w:val="LijstalineaChar"/>
     <w:autoRedefine/>
     <w:uiPriority w:val="34"/>
     <w:qFormat/>
@@ -16861,10 +16794,10 @@
       <w:lang w:eastAsia="nl-NL"/>
     </w:rPr>
   </w:style>
-  <w:style w:type="paragraph" w:styleId="CommentText">
+  <w:style w:type="paragraph" w:styleId="Tekstopmerking">
     <w:name w:val="annotation text"/>
-    <w:basedOn w:val="Normal"/>
-    <w:link w:val="CommentTextChar"/>
+    <w:basedOn w:val="Standaard"/>
+    <w:link w:val="TekstopmerkingChar"/>
     <w:uiPriority w:val="99"/>
     <w:semiHidden/>
     <w:unhideWhenUsed/>
@@ -16876,11 +16809,11 @@
       <w:szCs w:val="20"/>
     </w:rPr>
   </w:style>
-  <w:style w:type="paragraph" w:styleId="CommentSubject">
+  <w:style w:type="paragraph" w:styleId="Onderwerpvanopmerking">
     <w:name w:val="annotation subject"/>
-    <w:basedOn w:val="CommentText"/>
-    <w:next w:val="CommentText"/>
-    <w:link w:val="CommentSubjectChar"/>
+    <w:basedOn w:val="Tekstopmerking"/>
+    <w:next w:val="Tekstopmerking"/>
+    <w:link w:val="OnderwerpvanopmerkingChar"/>
     <w:uiPriority w:val="99"/>
     <w:semiHidden/>
     <w:unhideWhenUsed/>
@@ -16891,10 +16824,10 @@
       <w:bCs/>
     </w:rPr>
   </w:style>
-  <w:style w:type="paragraph" w:styleId="BalloonText">
+  <w:style w:type="paragraph" w:styleId="Ballontekst">
     <w:name w:val="Balloon Text"/>
-    <w:basedOn w:val="Normal"/>
-    <w:link w:val="BalloonTextChar"/>
+    <w:basedOn w:val="Standaard"/>
+    <w:link w:val="BallontekstChar"/>
     <w:uiPriority w:val="99"/>
     <w:semiHidden/>
     <w:unhideWhenUsed/>
@@ -16909,9 +16842,9 @@
       <w:szCs w:val="18"/>
     </w:rPr>
   </w:style>
-  <w:style w:type="paragraph" w:styleId="NormalWeb">
+  <w:style w:type="paragraph" w:styleId="Normaalweb">
     <w:name w:val="Normal (Web)"/>
-    <w:basedOn w:val="Normal"/>
+    <w:basedOn w:val="Standaard"/>
     <w:uiPriority w:val="99"/>
     <w:unhideWhenUsed/>
     <w:qFormat/>
@@ -16926,7 +16859,7 @@
       <w:lang w:eastAsia="nl-NL"/>
     </w:rPr>
   </w:style>
-  <w:style w:type="paragraph" w:styleId="NoSpacing">
+  <w:style w:type="paragraph" w:styleId="Geenafstand">
     <w:name w:val="No Spacing"/>
     <w:uiPriority w:val="1"/>
     <w:qFormat/>
@@ -16945,7 +16878,7 @@
   </w:style>
   <w:style w:type="paragraph" w:customStyle="1" w:styleId="paragraph">
     <w:name w:val="paragraph"/>
-    <w:basedOn w:val="Normal"/>
+    <w:basedOn w:val="Standaard"/>
     <w:qFormat/>
     <w:rsid w:val="00285604"/>
     <w:pPr>
@@ -16960,13 +16893,13 @@
   </w:style>
   <w:style w:type="paragraph" w:customStyle="1" w:styleId="HeaderandFooter">
     <w:name w:val="Header and Footer"/>
-    <w:basedOn w:val="Normal"/>
+    <w:basedOn w:val="Standaard"/>
     <w:qFormat/>
   </w:style>
-  <w:style w:type="paragraph" w:styleId="Header">
+  <w:style w:type="paragraph" w:styleId="Koptekst">
     <w:name w:val="header"/>
-    <w:basedOn w:val="Normal"/>
-    <w:link w:val="HeaderChar"/>
+    <w:basedOn w:val="Standaard"/>
+    <w:link w:val="KoptekstChar"/>
     <w:uiPriority w:val="99"/>
     <w:unhideWhenUsed/>
     <w:rsid w:val="00581384"/>
@@ -16982,10 +16915,10 @@
       <w:lang w:eastAsia="nl-NL"/>
     </w:rPr>
   </w:style>
-  <w:style w:type="paragraph" w:styleId="TOC1">
+  <w:style w:type="paragraph" w:styleId="Inhopg1">
     <w:name w:val="toc 1"/>
-    <w:basedOn w:val="Normal"/>
-    <w:next w:val="Normal"/>
+    <w:basedOn w:val="Standaard"/>
+    <w:next w:val="Standaard"/>
     <w:autoRedefine/>
     <w:uiPriority w:val="39"/>
     <w:unhideWhenUsed/>
@@ -17004,10 +16937,10 @@
       <w:szCs w:val="20"/>
     </w:rPr>
   </w:style>
-  <w:style w:type="paragraph" w:styleId="TOC2">
+  <w:style w:type="paragraph" w:styleId="Inhopg2">
     <w:name w:val="toc 2"/>
-    <w:basedOn w:val="Normal"/>
-    <w:next w:val="Normal"/>
+    <w:basedOn w:val="Standaard"/>
+    <w:next w:val="Standaard"/>
     <w:autoRedefine/>
     <w:uiPriority w:val="39"/>
     <w:unhideWhenUsed/>
@@ -17026,10 +16959,10 @@
       <w:szCs w:val="20"/>
     </w:rPr>
   </w:style>
-  <w:style w:type="paragraph" w:styleId="TOC3">
+  <w:style w:type="paragraph" w:styleId="Inhopg3">
     <w:name w:val="toc 3"/>
-    <w:basedOn w:val="Normal"/>
-    <w:next w:val="Normal"/>
+    <w:basedOn w:val="Standaard"/>
+    <w:next w:val="Standaard"/>
     <w:autoRedefine/>
     <w:uiPriority w:val="39"/>
     <w:unhideWhenUsed/>
@@ -17044,10 +16977,10 @@
       <w:szCs w:val="20"/>
     </w:rPr>
   </w:style>
-  <w:style w:type="paragraph" w:styleId="TOC4">
+  <w:style w:type="paragraph" w:styleId="Inhopg4">
     <w:name w:val="toc 4"/>
-    <w:basedOn w:val="Normal"/>
-    <w:next w:val="Normal"/>
+    <w:basedOn w:val="Standaard"/>
+    <w:next w:val="Standaard"/>
     <w:autoRedefine/>
     <w:uiPriority w:val="39"/>
     <w:unhideWhenUsed/>
@@ -17061,10 +16994,10 @@
       <w:szCs w:val="20"/>
     </w:rPr>
   </w:style>
-  <w:style w:type="paragraph" w:styleId="TOC5">
+  <w:style w:type="paragraph" w:styleId="Inhopg5">
     <w:name w:val="toc 5"/>
-    <w:basedOn w:val="Normal"/>
-    <w:next w:val="Normal"/>
+    <w:basedOn w:val="Standaard"/>
+    <w:next w:val="Standaard"/>
     <w:autoRedefine/>
     <w:uiPriority w:val="39"/>
     <w:unhideWhenUsed/>
@@ -17078,10 +17011,10 @@
       <w:szCs w:val="20"/>
     </w:rPr>
   </w:style>
-  <w:style w:type="paragraph" w:styleId="TOC6">
+  <w:style w:type="paragraph" w:styleId="Inhopg6">
     <w:name w:val="toc 6"/>
-    <w:basedOn w:val="Normal"/>
-    <w:next w:val="Normal"/>
+    <w:basedOn w:val="Standaard"/>
+    <w:next w:val="Standaard"/>
     <w:autoRedefine/>
     <w:uiPriority w:val="39"/>
     <w:unhideWhenUsed/>
@@ -17095,10 +17028,10 @@
       <w:szCs w:val="20"/>
     </w:rPr>
   </w:style>
-  <w:style w:type="paragraph" w:styleId="TOC7">
+  <w:style w:type="paragraph" w:styleId="Inhopg7">
     <w:name w:val="toc 7"/>
-    <w:basedOn w:val="Normal"/>
-    <w:next w:val="Normal"/>
+    <w:basedOn w:val="Standaard"/>
+    <w:next w:val="Standaard"/>
     <w:autoRedefine/>
     <w:uiPriority w:val="39"/>
     <w:unhideWhenUsed/>
@@ -17112,10 +17045,10 @@
       <w:szCs w:val="20"/>
     </w:rPr>
   </w:style>
-  <w:style w:type="paragraph" w:styleId="TOC8">
+  <w:style w:type="paragraph" w:styleId="Inhopg8">
     <w:name w:val="toc 8"/>
-    <w:basedOn w:val="Normal"/>
-    <w:next w:val="Normal"/>
+    <w:basedOn w:val="Standaard"/>
+    <w:next w:val="Standaard"/>
     <w:autoRedefine/>
     <w:uiPriority w:val="39"/>
     <w:unhideWhenUsed/>
@@ -17129,10 +17062,10 @@
       <w:szCs w:val="20"/>
     </w:rPr>
   </w:style>
-  <w:style w:type="paragraph" w:styleId="TOC9">
+  <w:style w:type="paragraph" w:styleId="Inhopg9">
     <w:name w:val="toc 9"/>
-    <w:basedOn w:val="Normal"/>
-    <w:next w:val="Normal"/>
+    <w:basedOn w:val="Standaard"/>
+    <w:next w:val="Standaard"/>
     <w:autoRedefine/>
     <w:uiPriority w:val="39"/>
     <w:unhideWhenUsed/>
@@ -17146,10 +17079,10 @@
       <w:szCs w:val="20"/>
     </w:rPr>
   </w:style>
-  <w:style w:type="paragraph" w:styleId="Footer">
+  <w:style w:type="paragraph" w:styleId="Voettekst">
     <w:name w:val="footer"/>
-    <w:basedOn w:val="Normal"/>
-    <w:link w:val="FooterChar"/>
+    <w:basedOn w:val="Standaard"/>
+    <w:link w:val="VoettekstChar"/>
     <w:uiPriority w:val="99"/>
     <w:unhideWhenUsed/>
     <w:rsid w:val="00017C54"/>
@@ -17163,7 +17096,7 @@
   </w:style>
   <w:style w:type="paragraph" w:customStyle="1" w:styleId="Kop">
     <w:name w:val="Kop"/>
-    <w:basedOn w:val="Heading1"/>
+    <w:basedOn w:val="Kop1"/>
     <w:link w:val="KopChar"/>
     <w:autoRedefine/>
     <w:qFormat/>
@@ -17174,7 +17107,7 @@
       <w:szCs w:val="28"/>
     </w:rPr>
   </w:style>
-  <w:style w:type="paragraph" w:styleId="Revision">
+  <w:style w:type="paragraph" w:styleId="Revisie">
     <w:name w:val="Revision"/>
     <w:uiPriority w:val="99"/>
     <w:semiHidden/>
@@ -17184,10 +17117,10 @@
       <w:rFonts w:ascii="Verdana" w:hAnsi="Verdana"/>
     </w:rPr>
   </w:style>
-  <w:style w:type="paragraph" w:styleId="FootnoteText">
+  <w:style w:type="paragraph" w:styleId="Voetnoottekst">
     <w:name w:val="footnote text"/>
-    <w:basedOn w:val="Normal"/>
-    <w:link w:val="FootnoteTextChar"/>
+    <w:basedOn w:val="Standaard"/>
+    <w:link w:val="VoetnoottekstChar"/>
     <w:uiPriority w:val="99"/>
     <w:semiHidden/>
     <w:unhideWhenUsed/>
@@ -17199,10 +17132,10 @@
       <w:szCs w:val="20"/>
     </w:rPr>
   </w:style>
-  <w:style w:type="paragraph" w:styleId="TableofFigures">
+  <w:style w:type="paragraph" w:styleId="Lijstmetafbeeldingen">
     <w:name w:val="table of figures"/>
-    <w:basedOn w:val="Normal"/>
-    <w:next w:val="Normal"/>
+    <w:basedOn w:val="Standaard"/>
+    <w:next w:val="Standaard"/>
     <w:uiPriority w:val="99"/>
     <w:unhideWhenUsed/>
     <w:rsid w:val="00FA446F"/>
@@ -17210,10 +17143,10 @@
       <w:spacing w:after="0"/>
     </w:pPr>
   </w:style>
-  <w:style w:type="paragraph" w:styleId="Bibliography">
+  <w:style w:type="paragraph" w:styleId="Bibliografie">
     <w:name w:val="Bibliography"/>
-    <w:basedOn w:val="Normal"/>
-    <w:next w:val="Normal"/>
+    <w:basedOn w:val="Standaard"/>
+    <w:next w:val="Standaard"/>
     <w:uiPriority w:val="37"/>
     <w:unhideWhenUsed/>
     <w:qFormat/>
@@ -17243,14 +17176,14 @@
       <w:sz w:val="16"/>
     </w:rPr>
   </w:style>
-  <w:style w:type="paragraph" w:styleId="IndexHeading">
+  <w:style w:type="paragraph" w:styleId="Indexkop">
     <w:name w:val="index heading"/>
     <w:basedOn w:val="Heading"/>
   </w:style>
-  <w:style w:type="paragraph" w:styleId="TOCHeading">
+  <w:style w:type="paragraph" w:styleId="Kopvaninhoudsopgave">
     <w:name w:val="TOC Heading"/>
-    <w:basedOn w:val="Heading1"/>
-    <w:next w:val="Normal"/>
+    <w:basedOn w:val="Kop1"/>
+    <w:next w:val="Standaard"/>
     <w:uiPriority w:val="39"/>
     <w:unhideWhenUsed/>
     <w:qFormat/>
@@ -17268,9 +17201,9 @@
       <w:lang w:val="en-GB" w:eastAsia="en-GB"/>
     </w:rPr>
   </w:style>
-  <w:style w:type="table" w:styleId="TableGrid">
+  <w:style w:type="table" w:styleId="Tabelraster">
     <w:name w:val="Table Grid"/>
-    <w:basedOn w:val="TableNormal"/>
+    <w:basedOn w:val="Standaardtabel"/>
     <w:uiPriority w:val="39"/>
     <w:rsid w:val="00CB1F87"/>
     <w:tblPr>
@@ -17286,7 +17219,7 @@
   </w:style>
   <w:style w:type="table" w:customStyle="1" w:styleId="TableGrid0">
     <w:name w:val="Table Grid0"/>
-    <w:basedOn w:val="TableNormal"/>
+    <w:basedOn w:val="Standaardtabel"/>
     <w:uiPriority w:val="39"/>
     <w:rsid w:val="00950403"/>
     <w:rPr>
@@ -17304,10 +17237,10 @@
       </w:tblBorders>
     </w:tblPr>
   </w:style>
-  <w:style w:type="paragraph" w:styleId="HTMLPreformatted">
+  <w:style w:type="paragraph" w:styleId="HTML-voorafopgemaakt">
     <w:name w:val="HTML Preformatted"/>
-    <w:basedOn w:val="Normal"/>
-    <w:link w:val="HTMLPreformattedChar"/>
+    <w:basedOn w:val="Standaard"/>
+    <w:link w:val="HTML-voorafopgemaaktChar"/>
     <w:uiPriority w:val="99"/>
     <w:semiHidden/>
     <w:unhideWhenUsed/>
@@ -17321,10 +17254,10 @@
       <w:szCs w:val="20"/>
     </w:rPr>
   </w:style>
-  <w:style w:type="character" w:customStyle="1" w:styleId="HTMLPreformattedChar">
-    <w:name w:val="HTML Preformatted Char"/>
-    <w:basedOn w:val="DefaultParagraphFont"/>
-    <w:link w:val="HTMLPreformatted"/>
+  <w:style w:type="character" w:customStyle="1" w:styleId="HTML-voorafopgemaaktChar">
+    <w:name w:val="HTML - vooraf opgemaakt Char"/>
+    <w:basedOn w:val="Standaardalinea-lettertype"/>
+    <w:link w:val="HTML-voorafopgemaakt"/>
     <w:uiPriority w:val="99"/>
     <w:semiHidden/>
     <w:rsid w:val="00292374"/>
@@ -17512,6 +17445,65 @@
 </file>
 
 <file path=customXml/item1.xml><?xml version="1.0" encoding="utf-8"?>
+<?mso-contentType ?>
+<FormTemplates xmlns="http://schemas.microsoft.com/sharepoint/v3/contenttype/forms">
+  <Display>DocumentLibraryForm</Display>
+  <Edit>DocumentLibraryForm</Edit>
+  <New>DocumentLibraryForm</New>
+</FormTemplates>
+</file>
+
+<file path=customXml/item2.xml><?xml version="1.0" encoding="utf-8"?>
+<p:properties xmlns:p="http://schemas.microsoft.com/office/2006/metadata/properties" xmlns:xsi="http://www.w3.org/2001/XMLSchema-instance" xmlns:pc="http://schemas.microsoft.com/office/infopath/2007/PartnerControls">
+  <documentManagement>
+    <lcf76f155ced4ddcb4097134ff3c332f xmlns="5a0fea93-0399-46f0-bc72-58639a628ca3">
+      <Terms xmlns="http://schemas.microsoft.com/office/infopath/2007/PartnerControls"/>
+    </lcf76f155ced4ddcb4097134ff3c332f>
+    <TaxCatchAll xmlns="64ed190b-0b4b-47ea-af6b-ed7b1d0a73ec" xsi:nil="true"/>
+  </documentManagement>
+</p:properties>
+</file>
+
+<file path=customXml/item3.xml><?xml version="1.0" encoding="utf-8"?>
+<b:Sources xmlns:b="http://schemas.openxmlformats.org/officeDocument/2006/bibliography" xmlns="http://schemas.openxmlformats.org/officeDocument/2006/bibliography" SelectedStyle="/APASixthEditionOfficeOnline.xsl" StyleName="APA" Version="6">
+  <b:Source>
+    <b:Tag>AdA20</b:Tag>
+    <b:SourceType>Report</b:SourceType>
+    <b:Guid>{CF76A8A1-391E-432E-8403-6460D8B326EB}</b:Guid>
+    <b:Author>
+      <b:Author>
+        <b:NameList>
+          <b:Person>
+            <b:Last>AdA</b:Last>
+          </b:Person>
+        </b:NameList>
+      </b:Author>
+    </b:Author>
+    <b:Title>Toetsregeling Associate Degrees Academie Roosendaal schooljaar 2020-2021</b:Title>
+    <b:Year>2020</b:Year>
+    <b:RefOrder>2</b:RefOrder>
+  </b:Source>
+  <b:Source>
+    <b:Tag>HBO141</b:Tag>
+    <b:SourceType>Report</b:SourceType>
+    <b:Guid>{4EAE439F-BA5E-8044-AF0D-99EFD964FECC}</b:Guid>
+    <b:Title>Domeinbeschrijving Bachelor of ICT</b:Title>
+    <b:Year>2018</b:Year>
+    <b:Author>
+      <b:Author>
+        <b:NameList>
+          <b:Person>
+            <b:Last>HBO-i stichting</b:Last>
+          </b:Person>
+        </b:NameList>
+      </b:Author>
+    </b:Author>
+    <b:RefOrder>1</b:RefOrder>
+  </b:Source>
+</b:Sources>
+</file>
+
+<file path=customXml/item4.xml><?xml version="1.0" encoding="utf-8"?>
 <ct:contentTypeSchema xmlns:ct="http://schemas.microsoft.com/office/2006/metadata/contentType" xmlns:ma="http://schemas.microsoft.com/office/2006/metadata/properties/metaAttributes" ct:_="" ma:_="" ma:contentTypeName="Document" ma:contentTypeID="0x0101005F34BEDE471C064FBA131F2D5440F628" ma:contentTypeVersion="19" ma:contentTypeDescription="Create a new document." ma:contentTypeScope="" ma:versionID="9e65a4cd0f9d3dc9fc04dc157731876b">
   <xsd:schema xmlns:xsd="http://www.w3.org/2001/XMLSchema" xmlns:xs="http://www.w3.org/2001/XMLSchema" xmlns:p="http://schemas.microsoft.com/office/2006/metadata/properties" xmlns:ns2="5a0fea93-0399-46f0-bc72-58639a628ca3" xmlns:ns3="64ed190b-0b4b-47ea-af6b-ed7b1d0a73ec" targetNamespace="http://schemas.microsoft.com/office/2006/metadata/properties" ma:root="true" ma:fieldsID="a6b1dc5e59b78297b83f2517b473badd" ns2:_="" ns3:_="">
     <xsd:import namespace="5a0fea93-0399-46f0-bc72-58639a628ca3"/>
@@ -17772,66 +17764,34 @@
 </ct:contentTypeSchema>
 </file>
 
-<file path=customXml/item2.xml><?xml version="1.0" encoding="utf-8"?>
-<?mso-contentType ?>
-<FormTemplates xmlns="http://schemas.microsoft.com/sharepoint/v3/contenttype/forms">
-  <Display>DocumentLibraryForm</Display>
-  <Edit>DocumentLibraryForm</Edit>
-  <New>DocumentLibraryForm</New>
-</FormTemplates>
+<file path=customXml/itemProps1.xml><?xml version="1.0" encoding="utf-8"?>
+<ds:datastoreItem xmlns:ds="http://schemas.openxmlformats.org/officeDocument/2006/customXml" ds:itemID="{9F4A115A-50D3-4A27-B600-EED049A8D4D0}">
+  <ds:schemaRefs>
+    <ds:schemaRef ds:uri="http://schemas.microsoft.com/sharepoint/v3/contenttype/forms"/>
+  </ds:schemaRefs>
+</ds:datastoreItem>
 </file>
 
-<file path=customXml/item3.xml><?xml version="1.0" encoding="utf-8"?>
-<b:Sources xmlns:b="http://schemas.openxmlformats.org/officeDocument/2006/bibliography" xmlns="http://schemas.openxmlformats.org/officeDocument/2006/bibliography" SelectedStyle="/APASixthEditionOfficeOnline.xsl" StyleName="APA" Version="6">
-  <b:Source>
-    <b:Tag>AdA20</b:Tag>
-    <b:SourceType>Report</b:SourceType>
-    <b:Guid>{CF76A8A1-391E-432E-8403-6460D8B326EB}</b:Guid>
-    <b:Author>
-      <b:Author>
-        <b:NameList>
-          <b:Person>
-            <b:Last>AdA</b:Last>
-          </b:Person>
-        </b:NameList>
-      </b:Author>
-    </b:Author>
-    <b:Title>Toetsregeling Associate Degrees Academie Roosendaal schooljaar 2020-2021</b:Title>
-    <b:Year>2020</b:Year>
-    <b:RefOrder>2</b:RefOrder>
-  </b:Source>
-  <b:Source>
-    <b:Tag>HBO141</b:Tag>
-    <b:SourceType>Report</b:SourceType>
-    <b:Guid>{4EAE439F-BA5E-8044-AF0D-99EFD964FECC}</b:Guid>
-    <b:Title>Domeinbeschrijving Bachelor of ICT</b:Title>
-    <b:Year>2018</b:Year>
-    <b:Author>
-      <b:Author>
-        <b:NameList>
-          <b:Person>
-            <b:Last>HBO-i stichting</b:Last>
-          </b:Person>
-        </b:NameList>
-      </b:Author>
-    </b:Author>
-    <b:RefOrder>1</b:RefOrder>
-  </b:Source>
-</b:Sources>
+<file path=customXml/itemProps2.xml><?xml version="1.0" encoding="utf-8"?>
+<ds:datastoreItem xmlns:ds="http://schemas.openxmlformats.org/officeDocument/2006/customXml" ds:itemID="{D8FC9337-0E22-4582-B0CF-28ADD9C4E7EA}">
+  <ds:schemaRefs>
+    <ds:schemaRef ds:uri="http://schemas.microsoft.com/office/2006/metadata/properties"/>
+    <ds:schemaRef ds:uri="http://schemas.microsoft.com/office/infopath/2007/PartnerControls"/>
+    <ds:schemaRef ds:uri="5a0fea93-0399-46f0-bc72-58639a628ca3"/>
+    <ds:schemaRef ds:uri="64ed190b-0b4b-47ea-af6b-ed7b1d0a73ec"/>
+  </ds:schemaRefs>
+</ds:datastoreItem>
 </file>
 
-<file path=customXml/item4.xml><?xml version="1.0" encoding="utf-8"?>
-<p:properties xmlns:p="http://schemas.microsoft.com/office/2006/metadata/properties" xmlns:xsi="http://www.w3.org/2001/XMLSchema-instance" xmlns:pc="http://schemas.microsoft.com/office/infopath/2007/PartnerControls">
-  <documentManagement>
-    <lcf76f155ced4ddcb4097134ff3c332f xmlns="5a0fea93-0399-46f0-bc72-58639a628ca3">
-      <Terms xmlns="http://schemas.microsoft.com/office/infopath/2007/PartnerControls"/>
-    </lcf76f155ced4ddcb4097134ff3c332f>
-    <TaxCatchAll xmlns="64ed190b-0b4b-47ea-af6b-ed7b1d0a73ec" xsi:nil="true"/>
-  </documentManagement>
-</p:properties>
+<file path=customXml/itemProps3.xml><?xml version="1.0" encoding="utf-8"?>
+<ds:datastoreItem xmlns:ds="http://schemas.openxmlformats.org/officeDocument/2006/customXml" ds:itemID="{D78F979B-63F7-F141-ACAE-B5004DAD91A4}">
+  <ds:schemaRefs>
+    <ds:schemaRef ds:uri="http://schemas.openxmlformats.org/officeDocument/2006/bibliography"/>
+  </ds:schemaRefs>
+</ds:datastoreItem>
 </file>
 
-<file path=customXml/itemProps1.xml><?xml version="1.0" encoding="utf-8"?>
+<file path=customXml/itemProps4.xml><?xml version="1.0" encoding="utf-8"?>
 <ds:datastoreItem xmlns:ds="http://schemas.openxmlformats.org/officeDocument/2006/customXml" ds:itemID="{F671A37B-0AEF-49EF-8FBD-4AEF3A3DFED5}">
   <ds:schemaRefs>
     <ds:schemaRef ds:uri="http://schemas.microsoft.com/office/2006/metadata/contentType"/>
@@ -17848,31 +17808,4 @@
     <ds:schemaRef ds:uri="http://schemas.microsoft.com/internal/obd"/>
   </ds:schemaRefs>
 </ds:datastoreItem>
-</file>
-
-<file path=customXml/itemProps2.xml><?xml version="1.0" encoding="utf-8"?>
-<ds:datastoreItem xmlns:ds="http://schemas.openxmlformats.org/officeDocument/2006/customXml" ds:itemID="{9F4A115A-50D3-4A27-B600-EED049A8D4D0}">
-  <ds:schemaRefs>
-    <ds:schemaRef ds:uri="http://schemas.microsoft.com/sharepoint/v3/contenttype/forms"/>
-  </ds:schemaRefs>
-</ds:datastoreItem>
-</file>
-
-<file path=customXml/itemProps3.xml><?xml version="1.0" encoding="utf-8"?>
-<ds:datastoreItem xmlns:ds="http://schemas.openxmlformats.org/officeDocument/2006/customXml" ds:itemID="{D78F979B-63F7-F141-ACAE-B5004DAD91A4}">
-  <ds:schemaRefs>
-    <ds:schemaRef ds:uri="http://schemas.openxmlformats.org/officeDocument/2006/bibliography"/>
-  </ds:schemaRefs>
-</ds:datastoreItem>
-</file>
-
-<file path=customXml/itemProps4.xml><?xml version="1.0" encoding="utf-8"?>
-<ds:datastoreItem xmlns:ds="http://schemas.openxmlformats.org/officeDocument/2006/customXml" ds:itemID="{D8FC9337-0E22-4582-B0CF-28ADD9C4E7EA}">
-  <ds:schemaRefs>
-    <ds:schemaRef ds:uri="http://schemas.microsoft.com/office/2006/metadata/properties"/>
-    <ds:schemaRef ds:uri="http://schemas.microsoft.com/office/infopath/2007/PartnerControls"/>
-    <ds:schemaRef ds:uri="5a0fea93-0399-46f0-bc72-58639a628ca3"/>
-    <ds:schemaRef ds:uri="64ed190b-0b4b-47ea-af6b-ed7b1d0a73ec"/>
-  </ds:schemaRefs>
-</ds:datastoreItem>
 </file>
</xml_diff>